<commit_message>
Grade 3 review: geometry as circle-the-answer questions
Questions 11-12 now give options to circle instead of blanks to fill in,
in both the site page and the printable Word file. The shapes image alt
text no longer gives away the answers.

Co-Authored-By: Claude Opus 5.5 <noreply@anthropic.com>
Claude-Session: https://claude.ai/code/session_01Pan7c2y9UcfWAvnPW8a3S5
</commit_message>
<xml_diff>
--- a/content/elementary/math/03-grade-3-test-review/_files/grade-3-math-review.docx
+++ b/content/elementary/math/03-grade-3-test-review/_files/grade-3-math-review.docx
@@ -143,7 +143,7 @@
         <w:keepNext/>
         <w:shd w:fill="E8EEF8" w:color="auto" w:val="clear"/>
         <w:bidi/>
-        <w:spacing w:after="120" w:before="320"/>
+        <w:spacing w:after="80" w:before="240"/>
         <w:jc w:val="center"/>
       </w:pPr>
       <w:r>
@@ -166,7 +166,7 @@
           <w:bottom w:val="single" w:color="C9D3E6" w:sz="4" w:space="2"/>
         </w:pBdr>
         <w:bidi/>
-        <w:spacing w:after="80" w:before="260"/>
+        <w:spacing w:after="60" w:before="200"/>
       </w:pPr>
       <w:r>
         <w:rPr>
@@ -302,7 +302,7 @@
           <w:bottom w:val="single" w:color="C9D3E6" w:sz="4" w:space="2"/>
         </w:pBdr>
         <w:bidi/>
-        <w:spacing w:after="80" w:before="260"/>
+        <w:spacing w:after="60" w:before="200"/>
       </w:pPr>
       <w:r>
         <w:rPr>
@@ -438,7 +438,7 @@
           <w:bottom w:val="single" w:color="C9D3E6" w:sz="4" w:space="2"/>
         </w:pBdr>
         <w:bidi/>
-        <w:spacing w:after="80" w:before="260"/>
+        <w:spacing w:after="60" w:before="200"/>
       </w:pPr>
       <w:r>
         <w:rPr>
@@ -527,7 +527,7 @@
           <w:p>
             <w:pPr>
               <w:bidi w:val="false"/>
-              <w:spacing w:after="100" w:before="100" w:line="300"/>
+              <w:spacing w:after="60" w:before="60" w:line="300"/>
               <w:jc w:val="center"/>
             </w:pPr>
             <w:r>
@@ -554,7 +554,7 @@
           <w:p>
             <w:pPr>
               <w:bidi w:val="false"/>
-              <w:spacing w:after="100" w:before="100" w:line="300"/>
+              <w:spacing w:after="60" w:before="60" w:line="300"/>
               <w:jc w:val="center"/>
             </w:pPr>
             <w:r>
@@ -581,7 +581,7 @@
           <w:p>
             <w:pPr>
               <w:bidi w:val="false"/>
-              <w:spacing w:after="100" w:before="100" w:line="300"/>
+              <w:spacing w:after="60" w:before="60" w:line="300"/>
               <w:jc w:val="center"/>
             </w:pPr>
             <w:r>
@@ -608,7 +608,7 @@
           <w:p>
             <w:pPr>
               <w:bidi w:val="false"/>
-              <w:spacing w:after="100" w:before="100" w:line="300"/>
+              <w:spacing w:after="60" w:before="60" w:line="300"/>
               <w:jc w:val="center"/>
             </w:pPr>
             <w:r>
@@ -635,7 +635,7 @@
           <w:p>
             <w:pPr>
               <w:bidi w:val="false"/>
-              <w:spacing w:after="100" w:before="100" w:line="300"/>
+              <w:spacing w:after="60" w:before="60" w:line="300"/>
               <w:jc w:val="center"/>
             </w:pPr>
             <w:r>
@@ -662,7 +662,7 @@
           <w:p>
             <w:pPr>
               <w:bidi w:val="false"/>
-              <w:spacing w:after="100" w:before="100" w:line="300"/>
+              <w:spacing w:after="60" w:before="60" w:line="300"/>
               <w:jc w:val="center"/>
             </w:pPr>
             <w:r>
@@ -1056,7 +1056,7 @@
           <w:bottom w:val="single" w:color="C9D3E6" w:sz="4" w:space="2"/>
         </w:pBdr>
         <w:bidi/>
-        <w:spacing w:after="80" w:before="260"/>
+        <w:spacing w:after="60" w:before="200"/>
       </w:pPr>
       <w:r>
         <w:rPr>
@@ -1298,7 +1298,7 @@
           <w:bottom w:val="single" w:color="C9D3E6" w:sz="4" w:space="2"/>
         </w:pBdr>
         <w:bidi/>
-        <w:spacing w:after="80" w:before="260"/>
+        <w:spacing w:after="60" w:before="200"/>
       </w:pPr>
       <w:r>
         <w:rPr>
@@ -1344,7 +1344,7 @@
           <w:p>
             <w:pPr>
               <w:bidi w:val="false"/>
-              <w:spacing w:after="100" w:before="100" w:line="300"/>
+              <w:spacing w:after="60" w:before="60" w:line="300"/>
               <w:jc w:val="center"/>
             </w:pPr>
             <w:r>
@@ -1383,7 +1383,7 @@
           <w:p>
             <w:pPr>
               <w:bidi w:val="false"/>
-              <w:spacing w:after="100" w:before="100" w:line="300"/>
+              <w:spacing w:after="60" w:before="60" w:line="300"/>
               <w:jc w:val="center"/>
             </w:pPr>
             <w:r>
@@ -1441,7 +1441,7 @@
           <w:p>
             <w:pPr>
               <w:bidi w:val="false"/>
-              <w:spacing w:after="100" w:before="100" w:line="300"/>
+              <w:spacing w:after="60" w:before="60" w:line="300"/>
               <w:jc w:val="center"/>
             </w:pPr>
             <w:r>
@@ -1487,12 +1487,11 @@
     <w:p>
       <w:pPr>
         <w:keepNext/>
-        <w:pageBreakBefore/>
         <w:pBdr>
           <w:bottom w:val="single" w:color="C9D3E6" w:sz="4" w:space="2"/>
         </w:pBdr>
         <w:bidi/>
-        <w:spacing w:after="80" w:before="260"/>
+        <w:spacing w:after="60" w:before="200"/>
       </w:pPr>
       <w:r>
         <w:rPr>
@@ -1553,8 +1552,9 @@
           </w:tcPr>
           <w:p>
             <w:pPr>
+              <w:keepNext/>
               <w:bidi w:val="false"/>
-              <w:spacing w:after="100" w:before="100" w:line="300"/>
+              <w:spacing w:after="60" w:before="60" w:line="300"/>
               <w:jc w:val="center"/>
             </w:pPr>
             <w:r>
@@ -1592,8 +1592,9 @@
           </w:tcPr>
           <w:p>
             <w:pPr>
+              <w:keepNext/>
               <w:bidi w:val="false"/>
-              <w:spacing w:after="100" w:before="100" w:line="300"/>
+              <w:spacing w:after="60" w:before="60" w:line="300"/>
               <w:jc w:val="center"/>
             </w:pPr>
             <w:r>
@@ -1652,7 +1653,7 @@
           <w:p>
             <w:pPr>
               <w:bidi w:val="false"/>
-              <w:spacing w:after="100" w:before="100" w:line="300"/>
+              <w:spacing w:after="60" w:before="60" w:line="300"/>
               <w:jc w:val="center"/>
             </w:pPr>
             <w:r>
@@ -1691,7 +1692,7 @@
           <w:p>
             <w:pPr>
               <w:bidi w:val="false"/>
-              <w:spacing w:after="100" w:before="100" w:line="300"/>
+              <w:spacing w:after="60" w:before="60" w:line="300"/>
               <w:jc w:val="center"/>
             </w:pPr>
             <w:r>
@@ -1726,7 +1727,7 @@
           <w:bottom w:val="single" w:color="C9D3E6" w:sz="4" w:space="2"/>
         </w:pBdr>
         <w:bidi/>
-        <w:spacing w:after="80" w:before="260"/>
+        <w:spacing w:after="60" w:before="200"/>
       </w:pPr>
       <w:r>
         <w:rPr>
@@ -1869,7 +1870,7 @@
         <w:keepNext/>
         <w:shd w:fill="E8EEF8" w:color="auto" w:val="clear"/>
         <w:bidi/>
-        <w:spacing w:after="120" w:before="320"/>
+        <w:spacing w:after="80" w:before="240"/>
         <w:jc w:val="center"/>
       </w:pPr>
       <w:r>
@@ -1892,7 +1893,7 @@
           <w:bottom w:val="single" w:color="C9D3E6" w:sz="4" w:space="2"/>
         </w:pBdr>
         <w:bidi/>
-        <w:spacing w:after="80" w:before="260"/>
+        <w:spacing w:after="60" w:before="200"/>
       </w:pPr>
       <w:r>
         <w:rPr>
@@ -2572,7 +2573,7 @@
           <w:bottom w:val="single" w:color="C9D3E6" w:sz="4" w:space="2"/>
         </w:pBdr>
         <w:bidi/>
-        <w:spacing w:after="80" w:before="260"/>
+        <w:spacing w:after="60" w:before="200"/>
       </w:pPr>
       <w:r>
         <w:rPr>
@@ -2620,7 +2621,7 @@
           <w:p>
             <w:pPr>
               <w:bidi w:val="false"/>
-              <w:spacing w:after="100" w:before="100" w:line="300"/>
+              <w:spacing w:after="60" w:before="60" w:line="300"/>
               <w:jc w:val="center"/>
             </w:pPr>
             <w:r>
@@ -2659,7 +2660,7 @@
           <w:p>
             <w:pPr>
               <w:bidi w:val="false"/>
-              <w:spacing w:after="100" w:before="100" w:line="300"/>
+              <w:spacing w:after="60" w:before="60" w:line="300"/>
               <w:jc w:val="center"/>
             </w:pPr>
             <w:r>
@@ -2698,7 +2699,7 @@
           <w:p>
             <w:pPr>
               <w:bidi w:val="false"/>
-              <w:spacing w:after="100" w:before="100" w:line="300"/>
+              <w:spacing w:after="60" w:before="60" w:line="300"/>
               <w:jc w:val="center"/>
             </w:pPr>
             <w:r>
@@ -2737,7 +2738,7 @@
           <w:p>
             <w:pPr>
               <w:bidi w:val="false"/>
-              <w:spacing w:after="100" w:before="100" w:line="300"/>
+              <w:spacing w:after="60" w:before="60" w:line="300"/>
               <w:jc w:val="center"/>
             </w:pPr>
             <w:r>
@@ -2797,7 +2798,7 @@
           <w:p>
             <w:pPr>
               <w:bidi w:val="false"/>
-              <w:spacing w:after="100" w:before="100" w:line="300"/>
+              <w:spacing w:after="60" w:before="60" w:line="300"/>
               <w:jc w:val="center"/>
             </w:pPr>
             <w:r>
@@ -2836,7 +2837,7 @@
           <w:p>
             <w:pPr>
               <w:bidi w:val="false"/>
-              <w:spacing w:after="100" w:before="100" w:line="300"/>
+              <w:spacing w:after="60" w:before="60" w:line="300"/>
               <w:jc w:val="center"/>
             </w:pPr>
             <w:r>
@@ -2875,7 +2876,7 @@
           <w:p>
             <w:pPr>
               <w:bidi w:val="false"/>
-              <w:spacing w:after="100" w:before="100" w:line="300"/>
+              <w:spacing w:after="60" w:before="60" w:line="300"/>
               <w:jc w:val="center"/>
             </w:pPr>
             <w:r>
@@ -3011,7 +3012,7 @@
           <w:p>
             <w:pPr>
               <w:bidi w:val="false"/>
-              <w:spacing w:after="100" w:before="100" w:line="300"/>
+              <w:spacing w:after="60" w:before="60" w:line="300"/>
               <w:jc w:val="center"/>
             </w:pPr>
             <w:r>
@@ -3038,7 +3039,7 @@
           <w:p>
             <w:pPr>
               <w:bidi w:val="false"/>
-              <w:spacing w:after="100" w:before="100" w:line="300"/>
+              <w:spacing w:after="60" w:before="60" w:line="300"/>
               <w:jc w:val="center"/>
             </w:pPr>
             <w:r>
@@ -3061,7 +3062,7 @@
           <w:bottom w:val="single" w:color="C9D3E6" w:sz="4" w:space="2"/>
         </w:pBdr>
         <w:bidi/>
-        <w:spacing w:after="80" w:before="260"/>
+        <w:spacing w:after="60" w:before="200"/>
       </w:pPr>
       <w:r>
         <w:rPr>
@@ -3134,7 +3135,7 @@
     <w:p>
       <w:pPr>
         <w:bidi/>
-        <w:spacing w:after="160" w:before="120" w:line="300"/>
+        <w:spacing w:after="120" w:before="100" w:line="300"/>
       </w:pPr>
       <w:r>
         <w:rPr>
@@ -3188,7 +3189,7 @@
     <w:p>
       <w:pPr>
         <w:bidi/>
-        <w:spacing w:after="160" w:before="120" w:line="300"/>
+        <w:spacing w:after="120" w:before="100" w:line="300"/>
       </w:pPr>
       <w:r>
         <w:rPr>
@@ -3242,7 +3243,7 @@
     <w:p>
       <w:pPr>
         <w:bidi/>
-        <w:spacing w:after="160" w:before="120" w:line="300"/>
+        <w:spacing w:after="120" w:before="100" w:line="300"/>
       </w:pPr>
       <w:r>
         <w:rPr>
@@ -3296,7 +3297,7 @@
     <w:p>
       <w:pPr>
         <w:bidi/>
-        <w:spacing w:after="160" w:before="120" w:line="300"/>
+        <w:spacing w:after="120" w:before="100" w:line="300"/>
       </w:pPr>
       <w:r>
         <w:rPr>
@@ -3313,7 +3314,7 @@
         <w:keepNext/>
         <w:shd w:fill="E8EEF8" w:color="auto" w:val="clear"/>
         <w:bidi/>
-        <w:spacing w:after="120" w:before="320"/>
+        <w:spacing w:after="80" w:before="240"/>
         <w:jc w:val="center"/>
       </w:pPr>
       <w:r>
@@ -3336,7 +3337,7 @@
           <w:bottom w:val="single" w:color="C9D3E6" w:sz="4" w:space="2"/>
         </w:pBdr>
         <w:bidi/>
-        <w:spacing w:after="80" w:before="260"/>
+        <w:spacing w:after="60" w:before="200"/>
       </w:pPr>
       <w:r>
         <w:rPr>
@@ -3360,7 +3361,7 @@
       <w:r>
         <w:drawing>
           <wp:inline distT="0" distB="0" distL="0" distR="0">
-            <wp:extent cx="5905500" cy="1038225"/>
+            <wp:extent cx="5143500" cy="904875"/>
             <wp:effectExtent t="0" r="0" b="0" l="0"/>
             <wp:docPr id="2" name="" descr="" title=""/>
             <wp:cNvGraphicFramePr>
@@ -3385,7 +3386,7 @@
                   <pic:spPr bwMode="auto">
                     <a:xfrm>
                       <a:off x="0" y="0"/>
-                      <a:ext cx="5905500" cy="1038225"/>
+                      <a:ext cx="5143500" cy="904875"/>
                     </a:xfrm>
                     <a:prstGeom prst="rect">
                       <a:avLst/>
@@ -3409,6 +3410,24 @@
           <w:rFonts w:ascii="Arial" w:cs="Arial" w:hAnsi="Arial"/>
           <w:b/>
           <w:bCs/>
+          <w:sz w:val="26"/>
+          <w:szCs w:val="26"/>
+          <w:rtl/>
+        </w:rPr>
+        <w:t xml:space="preserve">הקיפו בעיגול את התשובה הנכונה.</w:t>
+      </w:r>
+    </w:p>
+    <w:p>
+      <w:pPr>
+        <w:keepNext/>
+        <w:bidi/>
+        <w:spacing w:after="60" w:before="60" w:line="300"/>
+      </w:pPr>
+      <w:r>
+        <w:rPr>
+          <w:rFonts w:ascii="Arial" w:cs="Arial" w:hAnsi="Arial"/>
+          <w:b/>
+          <w:bCs/>
           <w:color w:val="C98A00"/>
           <w:sz w:val="26"/>
           <w:szCs w:val="26"/>
@@ -3434,51 +3453,50 @@
           <w:szCs w:val="26"/>
           <w:rtl/>
         </w:rPr>
-        <w:t xml:space="preserve">כתבו את שם הצורה:</w:t>
+        <w:t xml:space="preserve">מה השם של כל צורה?</w:t>
       </w:r>
     </w:p>
     <w:tbl>
       <w:tblPr>
         <w:bidiVisual/>
         <w:tblW w:type="dxa" w:w="9904"/>
-        <w:jc w:val="center"/>
         <w:tblBorders>
-          <w:top w:val="single" w:color="auto" w:sz="4"/>
-          <w:left w:val="single" w:color="auto" w:sz="4"/>
-          <w:bottom w:val="single" w:color="auto" w:sz="4"/>
-          <w:right w:val="single" w:color="auto" w:sz="4"/>
-          <w:insideH w:val="single" w:color="auto" w:sz="4"/>
-          <w:insideV w:val="single" w:color="auto" w:sz="4"/>
+          <w:top w:val="none" w:color="FFFFFF" w:sz="0"/>
+          <w:left w:val="none" w:color="FFFFFF" w:sz="0"/>
+          <w:bottom w:val="none" w:color="FFFFFF" w:sz="0"/>
+          <w:right w:val="none" w:color="FFFFFF" w:sz="0"/>
+          <w:insideH w:val="none" w:color="FFFFFF" w:sz="0"/>
+          <w:insideV w:val="none" w:color="FFFFFF" w:sz="0"/>
         </w:tblBorders>
         <w:tblLayout w:type="fixed"/>
       </w:tblPr>
       <w:tblGrid>
-        <w:gridCol w:w="2476"/>
-        <w:gridCol w:w="2476"/>
-        <w:gridCol w:w="2476"/>
-        <w:gridCol w:w="2476"/>
+        <w:gridCol w:w="1900"/>
+        <w:gridCol w:w="2001"/>
+        <w:gridCol w:w="2001"/>
+        <w:gridCol w:w="2001"/>
+        <w:gridCol w:w="2001"/>
       </w:tblGrid>
       <w:tr>
         <w:trPr>
-          <w:trHeight w:val="420" w:hRule="atLeast"/>
+          <w:cantSplit/>
+          <w:trHeight w:val="400" w:hRule="atLeast"/>
         </w:trPr>
         <w:tc>
           <w:tcPr>
-            <w:tcW w:type="dxa" w:w="2476"/>
-            <w:tcBorders>
-              <w:top w:val="single" w:color="777777" w:sz="6"/>
-              <w:left w:val="single" w:color="777777" w:sz="6"/>
-              <w:bottom w:val="single" w:color="777777" w:sz="6"/>
-              <w:right w:val="single" w:color="777777" w:sz="6"/>
-            </w:tcBorders>
-            <w:shd w:fill="EEF2F8" w:color="auto" w:val="clear"/>
-            <w:vAlign w:val="center"/>
-          </w:tcPr>
-          <w:p>
-            <w:pPr>
-              <w:bidi/>
-              <w:spacing w:after="40" w:before="40" w:line="300"/>
-              <w:jc w:val="center"/>
+            <w:tcW w:type="dxa" w:w="1900"/>
+            <w:tcBorders>
+              <w:top w:val="none" w:color="FFFFFF" w:sz="0"/>
+              <w:left w:val="none" w:color="FFFFFF" w:sz="0"/>
+              <w:bottom w:val="none" w:color="FFFFFF" w:sz="0"/>
+              <w:right w:val="none" w:color="FFFFFF" w:sz="0"/>
+            </w:tcBorders>
+            <w:vAlign w:val="center"/>
+          </w:tcPr>
+          <w:p>
+            <w:pPr>
+              <w:bidi/>
+              <w:spacing w:after="30" w:before="30" w:line="300"/>
             </w:pPr>
             <w:r>
               <w:rPr>
@@ -3495,182 +3513,562 @@
         </w:tc>
         <w:tc>
           <w:tcPr>
-            <w:tcW w:type="dxa" w:w="2476"/>
-            <w:tcBorders>
-              <w:top w:val="single" w:color="777777" w:sz="6"/>
-              <w:left w:val="single" w:color="777777" w:sz="6"/>
-              <w:bottom w:val="single" w:color="777777" w:sz="6"/>
-              <w:right w:val="single" w:color="777777" w:sz="6"/>
-            </w:tcBorders>
-            <w:shd w:fill="EEF2F8" w:color="auto" w:val="clear"/>
-            <w:vAlign w:val="center"/>
-          </w:tcPr>
-          <w:p>
-            <w:pPr>
-              <w:bidi/>
-              <w:spacing w:after="40" w:before="40" w:line="300"/>
-              <w:jc w:val="center"/>
-            </w:pPr>
-            <w:r>
-              <w:rPr>
-                <w:rFonts w:ascii="Arial" w:cs="Arial" w:hAnsi="Arial"/>
-                <w:b/>
-                <w:bCs/>
-                <w:sz w:val="26"/>
-                <w:szCs w:val="26"/>
-                <w:rtl/>
-              </w:rPr>
-              <w:t xml:space="preserve">צורה 2</w:t>
-            </w:r>
-          </w:p>
-        </w:tc>
-        <w:tc>
-          <w:tcPr>
-            <w:tcW w:type="dxa" w:w="2476"/>
-            <w:tcBorders>
-              <w:top w:val="single" w:color="777777" w:sz="6"/>
-              <w:left w:val="single" w:color="777777" w:sz="6"/>
-              <w:bottom w:val="single" w:color="777777" w:sz="6"/>
-              <w:right w:val="single" w:color="777777" w:sz="6"/>
-            </w:tcBorders>
-            <w:shd w:fill="EEF2F8" w:color="auto" w:val="clear"/>
-            <w:vAlign w:val="center"/>
-          </w:tcPr>
-          <w:p>
-            <w:pPr>
-              <w:bidi/>
-              <w:spacing w:after="40" w:before="40" w:line="300"/>
-              <w:jc w:val="center"/>
-            </w:pPr>
-            <w:r>
-              <w:rPr>
-                <w:rFonts w:ascii="Arial" w:cs="Arial" w:hAnsi="Arial"/>
-                <w:b/>
-                <w:bCs/>
-                <w:sz w:val="26"/>
-                <w:szCs w:val="26"/>
-                <w:rtl/>
-              </w:rPr>
-              <w:t xml:space="preserve">צורה 3</w:t>
-            </w:r>
-          </w:p>
-        </w:tc>
-        <w:tc>
-          <w:tcPr>
-            <w:tcW w:type="dxa" w:w="2476"/>
-            <w:tcBorders>
-              <w:top w:val="single" w:color="777777" w:sz="6"/>
-              <w:left w:val="single" w:color="777777" w:sz="6"/>
-              <w:bottom w:val="single" w:color="777777" w:sz="6"/>
-              <w:right w:val="single" w:color="777777" w:sz="6"/>
-            </w:tcBorders>
-            <w:shd w:fill="EEF2F8" w:color="auto" w:val="clear"/>
-            <w:vAlign w:val="center"/>
-          </w:tcPr>
-          <w:p>
-            <w:pPr>
-              <w:bidi/>
-              <w:spacing w:after="40" w:before="40" w:line="300"/>
-              <w:jc w:val="center"/>
-            </w:pPr>
-            <w:r>
-              <w:rPr>
-                <w:rFonts w:ascii="Arial" w:cs="Arial" w:hAnsi="Arial"/>
-                <w:b/>
-                <w:bCs/>
-                <w:sz w:val="26"/>
-                <w:szCs w:val="26"/>
-                <w:rtl/>
-              </w:rPr>
-              <w:t xml:space="preserve">צורה 5</w:t>
+            <w:tcW w:type="dxa" w:w="2001"/>
+            <w:tcBorders>
+              <w:top w:val="none" w:color="FFFFFF" w:sz="0"/>
+              <w:left w:val="none" w:color="FFFFFF" w:sz="0"/>
+              <w:bottom w:val="none" w:color="FFFFFF" w:sz="0"/>
+              <w:right w:val="none" w:color="FFFFFF" w:sz="0"/>
+            </w:tcBorders>
+            <w:vAlign w:val="center"/>
+          </w:tcPr>
+          <w:p>
+            <w:pPr>
+              <w:bidi/>
+              <w:spacing w:after="30" w:before="30" w:line="300"/>
+              <w:jc w:val="center"/>
+            </w:pPr>
+            <w:r>
+              <w:rPr>
+                <w:rFonts w:ascii="Arial" w:cs="Arial" w:hAnsi="Arial"/>
+                <w:sz w:val="26"/>
+                <w:szCs w:val="26"/>
+                <w:rtl/>
+              </w:rPr>
+              <w:t xml:space="preserve">משולש</w:t>
+            </w:r>
+          </w:p>
+        </w:tc>
+        <w:tc>
+          <w:tcPr>
+            <w:tcW w:type="dxa" w:w="2001"/>
+            <w:tcBorders>
+              <w:top w:val="none" w:color="FFFFFF" w:sz="0"/>
+              <w:left w:val="none" w:color="FFFFFF" w:sz="0"/>
+              <w:bottom w:val="none" w:color="FFFFFF" w:sz="0"/>
+              <w:right w:val="none" w:color="FFFFFF" w:sz="0"/>
+            </w:tcBorders>
+            <w:vAlign w:val="center"/>
+          </w:tcPr>
+          <w:p>
+            <w:pPr>
+              <w:bidi/>
+              <w:spacing w:after="30" w:before="30" w:line="300"/>
+              <w:jc w:val="center"/>
+            </w:pPr>
+            <w:r>
+              <w:rPr>
+                <w:rFonts w:ascii="Arial" w:cs="Arial" w:hAnsi="Arial"/>
+                <w:sz w:val="26"/>
+                <w:szCs w:val="26"/>
+                <w:rtl/>
+              </w:rPr>
+              <w:t xml:space="preserve">מרובע</w:t>
+            </w:r>
+          </w:p>
+        </w:tc>
+        <w:tc>
+          <w:tcPr>
+            <w:tcW w:type="dxa" w:w="2001"/>
+            <w:tcBorders>
+              <w:top w:val="none" w:color="FFFFFF" w:sz="0"/>
+              <w:left w:val="none" w:color="FFFFFF" w:sz="0"/>
+              <w:bottom w:val="none" w:color="FFFFFF" w:sz="0"/>
+              <w:right w:val="none" w:color="FFFFFF" w:sz="0"/>
+            </w:tcBorders>
+            <w:vAlign w:val="center"/>
+          </w:tcPr>
+          <w:p>
+            <w:pPr>
+              <w:bidi/>
+              <w:spacing w:after="30" w:before="30" w:line="300"/>
+              <w:jc w:val="center"/>
+            </w:pPr>
+            <w:r>
+              <w:rPr>
+                <w:rFonts w:ascii="Arial" w:cs="Arial" w:hAnsi="Arial"/>
+                <w:sz w:val="26"/>
+                <w:szCs w:val="26"/>
+                <w:rtl/>
+              </w:rPr>
+              <w:t xml:space="preserve">מחומש</w:t>
+            </w:r>
+          </w:p>
+        </w:tc>
+        <w:tc>
+          <w:tcPr>
+            <w:tcW w:type="dxa" w:w="2001"/>
+            <w:tcBorders>
+              <w:top w:val="none" w:color="FFFFFF" w:sz="0"/>
+              <w:left w:val="none" w:color="FFFFFF" w:sz="0"/>
+              <w:bottom w:val="none" w:color="FFFFFF" w:sz="0"/>
+              <w:right w:val="none" w:color="FFFFFF" w:sz="0"/>
+            </w:tcBorders>
+            <w:vAlign w:val="center"/>
+          </w:tcPr>
+          <w:p>
+            <w:pPr>
+              <w:bidi/>
+              <w:spacing w:after="30" w:before="30" w:line="300"/>
+              <w:jc w:val="center"/>
+            </w:pPr>
+            <w:r>
+              <w:rPr>
+                <w:rFonts w:ascii="Arial" w:cs="Arial" w:hAnsi="Arial"/>
+                <w:sz w:val="26"/>
+                <w:szCs w:val="26"/>
+                <w:rtl/>
+              </w:rPr>
+              <w:t xml:space="preserve">משושה</w:t>
             </w:r>
           </w:p>
         </w:tc>
       </w:tr>
       <w:tr>
         <w:trPr>
-          <w:trHeight w:val="560" w:hRule="atLeast"/>
+          <w:cantSplit/>
+          <w:trHeight w:val="400" w:hRule="atLeast"/>
         </w:trPr>
         <w:tc>
           <w:tcPr>
-            <w:tcW w:type="dxa" w:w="2476"/>
-            <w:tcBorders>
-              <w:top w:val="single" w:color="777777" w:sz="6"/>
-              <w:left w:val="single" w:color="777777" w:sz="6"/>
-              <w:bottom w:val="single" w:color="777777" w:sz="6"/>
-              <w:right w:val="single" w:color="777777" w:sz="6"/>
-            </w:tcBorders>
-            <w:vAlign w:val="center"/>
-          </w:tcPr>
-          <w:p>
-            <w:pPr>
-              <w:bidi/>
-              <w:spacing w:after="40" w:before="40" w:line="300"/>
-              <w:jc w:val="center"/>
-            </w:pPr>
-          </w:p>
-        </w:tc>
-        <w:tc>
-          <w:tcPr>
-            <w:tcW w:type="dxa" w:w="2476"/>
-            <w:tcBorders>
-              <w:top w:val="single" w:color="777777" w:sz="6"/>
-              <w:left w:val="single" w:color="777777" w:sz="6"/>
-              <w:bottom w:val="single" w:color="777777" w:sz="6"/>
-              <w:right w:val="single" w:color="777777" w:sz="6"/>
-            </w:tcBorders>
-            <w:vAlign w:val="center"/>
-          </w:tcPr>
-          <w:p>
-            <w:pPr>
-              <w:bidi/>
-              <w:spacing w:after="40" w:before="40" w:line="300"/>
-              <w:jc w:val="center"/>
-            </w:pPr>
-          </w:p>
-        </w:tc>
-        <w:tc>
-          <w:tcPr>
-            <w:tcW w:type="dxa" w:w="2476"/>
-            <w:tcBorders>
-              <w:top w:val="single" w:color="777777" w:sz="6"/>
-              <w:left w:val="single" w:color="777777" w:sz="6"/>
-              <w:bottom w:val="single" w:color="777777" w:sz="6"/>
-              <w:right w:val="single" w:color="777777" w:sz="6"/>
-            </w:tcBorders>
-            <w:vAlign w:val="center"/>
-          </w:tcPr>
-          <w:p>
-            <w:pPr>
-              <w:bidi/>
-              <w:spacing w:after="40" w:before="40" w:line="300"/>
-              <w:jc w:val="center"/>
-            </w:pPr>
-          </w:p>
-        </w:tc>
-        <w:tc>
-          <w:tcPr>
-            <w:tcW w:type="dxa" w:w="2476"/>
-            <w:tcBorders>
-              <w:top w:val="single" w:color="777777" w:sz="6"/>
-              <w:left w:val="single" w:color="777777" w:sz="6"/>
-              <w:bottom w:val="single" w:color="777777" w:sz="6"/>
-              <w:right w:val="single" w:color="777777" w:sz="6"/>
-            </w:tcBorders>
-            <w:vAlign w:val="center"/>
-          </w:tcPr>
-          <w:p>
-            <w:pPr>
-              <w:bidi/>
-              <w:spacing w:after="40" w:before="40" w:line="300"/>
-              <w:jc w:val="center"/>
-            </w:pPr>
+            <w:tcW w:type="dxa" w:w="1900"/>
+            <w:tcBorders>
+              <w:top w:val="none" w:color="FFFFFF" w:sz="0"/>
+              <w:left w:val="none" w:color="FFFFFF" w:sz="0"/>
+              <w:bottom w:val="none" w:color="FFFFFF" w:sz="0"/>
+              <w:right w:val="none" w:color="FFFFFF" w:sz="0"/>
+            </w:tcBorders>
+            <w:vAlign w:val="center"/>
+          </w:tcPr>
+          <w:p>
+            <w:pPr>
+              <w:bidi/>
+              <w:spacing w:after="30" w:before="30" w:line="300"/>
+            </w:pPr>
+            <w:r>
+              <w:rPr>
+                <w:rFonts w:ascii="Arial" w:cs="Arial" w:hAnsi="Arial"/>
+                <w:b/>
+                <w:bCs/>
+                <w:sz w:val="26"/>
+                <w:szCs w:val="26"/>
+                <w:rtl/>
+              </w:rPr>
+              <w:t xml:space="preserve">צורה 2</w:t>
+            </w:r>
+          </w:p>
+        </w:tc>
+        <w:tc>
+          <w:tcPr>
+            <w:tcW w:type="dxa" w:w="2001"/>
+            <w:tcBorders>
+              <w:top w:val="none" w:color="FFFFFF" w:sz="0"/>
+              <w:left w:val="none" w:color="FFFFFF" w:sz="0"/>
+              <w:bottom w:val="none" w:color="FFFFFF" w:sz="0"/>
+              <w:right w:val="none" w:color="FFFFFF" w:sz="0"/>
+            </w:tcBorders>
+            <w:vAlign w:val="center"/>
+          </w:tcPr>
+          <w:p>
+            <w:pPr>
+              <w:bidi/>
+              <w:spacing w:after="30" w:before="30" w:line="300"/>
+              <w:jc w:val="center"/>
+            </w:pPr>
+            <w:r>
+              <w:rPr>
+                <w:rFonts w:ascii="Arial" w:cs="Arial" w:hAnsi="Arial"/>
+                <w:sz w:val="26"/>
+                <w:szCs w:val="26"/>
+                <w:rtl/>
+              </w:rPr>
+              <w:t xml:space="preserve">משולש</w:t>
+            </w:r>
+          </w:p>
+        </w:tc>
+        <w:tc>
+          <w:tcPr>
+            <w:tcW w:type="dxa" w:w="2001"/>
+            <w:tcBorders>
+              <w:top w:val="none" w:color="FFFFFF" w:sz="0"/>
+              <w:left w:val="none" w:color="FFFFFF" w:sz="0"/>
+              <w:bottom w:val="none" w:color="FFFFFF" w:sz="0"/>
+              <w:right w:val="none" w:color="FFFFFF" w:sz="0"/>
+            </w:tcBorders>
+            <w:vAlign w:val="center"/>
+          </w:tcPr>
+          <w:p>
+            <w:pPr>
+              <w:bidi/>
+              <w:spacing w:after="30" w:before="30" w:line="300"/>
+              <w:jc w:val="center"/>
+            </w:pPr>
+            <w:r>
+              <w:rPr>
+                <w:rFonts w:ascii="Arial" w:cs="Arial" w:hAnsi="Arial"/>
+                <w:sz w:val="26"/>
+                <w:szCs w:val="26"/>
+                <w:rtl/>
+              </w:rPr>
+              <w:t xml:space="preserve">מרובע</w:t>
+            </w:r>
+          </w:p>
+        </w:tc>
+        <w:tc>
+          <w:tcPr>
+            <w:tcW w:type="dxa" w:w="2001"/>
+            <w:tcBorders>
+              <w:top w:val="none" w:color="FFFFFF" w:sz="0"/>
+              <w:left w:val="none" w:color="FFFFFF" w:sz="0"/>
+              <w:bottom w:val="none" w:color="FFFFFF" w:sz="0"/>
+              <w:right w:val="none" w:color="FFFFFF" w:sz="0"/>
+            </w:tcBorders>
+            <w:vAlign w:val="center"/>
+          </w:tcPr>
+          <w:p>
+            <w:pPr>
+              <w:bidi/>
+              <w:spacing w:after="30" w:before="30" w:line="300"/>
+              <w:jc w:val="center"/>
+            </w:pPr>
+            <w:r>
+              <w:rPr>
+                <w:rFonts w:ascii="Arial" w:cs="Arial" w:hAnsi="Arial"/>
+                <w:sz w:val="26"/>
+                <w:szCs w:val="26"/>
+                <w:rtl/>
+              </w:rPr>
+              <w:t xml:space="preserve">מחומש</w:t>
+            </w:r>
+          </w:p>
+        </w:tc>
+        <w:tc>
+          <w:tcPr>
+            <w:tcW w:type="dxa" w:w="2001"/>
+            <w:tcBorders>
+              <w:top w:val="none" w:color="FFFFFF" w:sz="0"/>
+              <w:left w:val="none" w:color="FFFFFF" w:sz="0"/>
+              <w:bottom w:val="none" w:color="FFFFFF" w:sz="0"/>
+              <w:right w:val="none" w:color="FFFFFF" w:sz="0"/>
+            </w:tcBorders>
+            <w:vAlign w:val="center"/>
+          </w:tcPr>
+          <w:p>
+            <w:pPr>
+              <w:bidi/>
+              <w:spacing w:after="30" w:before="30" w:line="300"/>
+              <w:jc w:val="center"/>
+            </w:pPr>
+            <w:r>
+              <w:rPr>
+                <w:rFonts w:ascii="Arial" w:cs="Arial" w:hAnsi="Arial"/>
+                <w:sz w:val="26"/>
+                <w:szCs w:val="26"/>
+                <w:rtl/>
+              </w:rPr>
+              <w:t xml:space="preserve">משושה</w:t>
+            </w:r>
+          </w:p>
+        </w:tc>
+      </w:tr>
+      <w:tr>
+        <w:trPr>
+          <w:cantSplit/>
+          <w:trHeight w:val="400" w:hRule="atLeast"/>
+        </w:trPr>
+        <w:tc>
+          <w:tcPr>
+            <w:tcW w:type="dxa" w:w="1900"/>
+            <w:tcBorders>
+              <w:top w:val="none" w:color="FFFFFF" w:sz="0"/>
+              <w:left w:val="none" w:color="FFFFFF" w:sz="0"/>
+              <w:bottom w:val="none" w:color="FFFFFF" w:sz="0"/>
+              <w:right w:val="none" w:color="FFFFFF" w:sz="0"/>
+            </w:tcBorders>
+            <w:vAlign w:val="center"/>
+          </w:tcPr>
+          <w:p>
+            <w:pPr>
+              <w:bidi/>
+              <w:spacing w:after="30" w:before="30" w:line="300"/>
+            </w:pPr>
+            <w:r>
+              <w:rPr>
+                <w:rFonts w:ascii="Arial" w:cs="Arial" w:hAnsi="Arial"/>
+                <w:b/>
+                <w:bCs/>
+                <w:sz w:val="26"/>
+                <w:szCs w:val="26"/>
+                <w:rtl/>
+              </w:rPr>
+              <w:t xml:space="preserve">צורה 3</w:t>
+            </w:r>
+          </w:p>
+        </w:tc>
+        <w:tc>
+          <w:tcPr>
+            <w:tcW w:type="dxa" w:w="2001"/>
+            <w:tcBorders>
+              <w:top w:val="none" w:color="FFFFFF" w:sz="0"/>
+              <w:left w:val="none" w:color="FFFFFF" w:sz="0"/>
+              <w:bottom w:val="none" w:color="FFFFFF" w:sz="0"/>
+              <w:right w:val="none" w:color="FFFFFF" w:sz="0"/>
+            </w:tcBorders>
+            <w:vAlign w:val="center"/>
+          </w:tcPr>
+          <w:p>
+            <w:pPr>
+              <w:bidi/>
+              <w:spacing w:after="30" w:before="30" w:line="300"/>
+              <w:jc w:val="center"/>
+            </w:pPr>
+            <w:r>
+              <w:rPr>
+                <w:rFonts w:ascii="Arial" w:cs="Arial" w:hAnsi="Arial"/>
+                <w:sz w:val="26"/>
+                <w:szCs w:val="26"/>
+                <w:rtl/>
+              </w:rPr>
+              <w:t xml:space="preserve">משולש</w:t>
+            </w:r>
+          </w:p>
+        </w:tc>
+        <w:tc>
+          <w:tcPr>
+            <w:tcW w:type="dxa" w:w="2001"/>
+            <w:tcBorders>
+              <w:top w:val="none" w:color="FFFFFF" w:sz="0"/>
+              <w:left w:val="none" w:color="FFFFFF" w:sz="0"/>
+              <w:bottom w:val="none" w:color="FFFFFF" w:sz="0"/>
+              <w:right w:val="none" w:color="FFFFFF" w:sz="0"/>
+            </w:tcBorders>
+            <w:vAlign w:val="center"/>
+          </w:tcPr>
+          <w:p>
+            <w:pPr>
+              <w:bidi/>
+              <w:spacing w:after="30" w:before="30" w:line="300"/>
+              <w:jc w:val="center"/>
+            </w:pPr>
+            <w:r>
+              <w:rPr>
+                <w:rFonts w:ascii="Arial" w:cs="Arial" w:hAnsi="Arial"/>
+                <w:sz w:val="26"/>
+                <w:szCs w:val="26"/>
+                <w:rtl/>
+              </w:rPr>
+              <w:t xml:space="preserve">מרובע</w:t>
+            </w:r>
+          </w:p>
+        </w:tc>
+        <w:tc>
+          <w:tcPr>
+            <w:tcW w:type="dxa" w:w="2001"/>
+            <w:tcBorders>
+              <w:top w:val="none" w:color="FFFFFF" w:sz="0"/>
+              <w:left w:val="none" w:color="FFFFFF" w:sz="0"/>
+              <w:bottom w:val="none" w:color="FFFFFF" w:sz="0"/>
+              <w:right w:val="none" w:color="FFFFFF" w:sz="0"/>
+            </w:tcBorders>
+            <w:vAlign w:val="center"/>
+          </w:tcPr>
+          <w:p>
+            <w:pPr>
+              <w:bidi/>
+              <w:spacing w:after="30" w:before="30" w:line="300"/>
+              <w:jc w:val="center"/>
+            </w:pPr>
+            <w:r>
+              <w:rPr>
+                <w:rFonts w:ascii="Arial" w:cs="Arial" w:hAnsi="Arial"/>
+                <w:sz w:val="26"/>
+                <w:szCs w:val="26"/>
+                <w:rtl/>
+              </w:rPr>
+              <w:t xml:space="preserve">מחומש</w:t>
+            </w:r>
+          </w:p>
+        </w:tc>
+        <w:tc>
+          <w:tcPr>
+            <w:tcW w:type="dxa" w:w="2001"/>
+            <w:tcBorders>
+              <w:top w:val="none" w:color="FFFFFF" w:sz="0"/>
+              <w:left w:val="none" w:color="FFFFFF" w:sz="0"/>
+              <w:bottom w:val="none" w:color="FFFFFF" w:sz="0"/>
+              <w:right w:val="none" w:color="FFFFFF" w:sz="0"/>
+            </w:tcBorders>
+            <w:vAlign w:val="center"/>
+          </w:tcPr>
+          <w:p>
+            <w:pPr>
+              <w:bidi/>
+              <w:spacing w:after="30" w:before="30" w:line="300"/>
+              <w:jc w:val="center"/>
+            </w:pPr>
+            <w:r>
+              <w:rPr>
+                <w:rFonts w:ascii="Arial" w:cs="Arial" w:hAnsi="Arial"/>
+                <w:sz w:val="26"/>
+                <w:szCs w:val="26"/>
+                <w:rtl/>
+              </w:rPr>
+              <w:t xml:space="preserve">משושה</w:t>
+            </w:r>
+          </w:p>
+        </w:tc>
+      </w:tr>
+      <w:tr>
+        <w:trPr>
+          <w:cantSplit/>
+          <w:trHeight w:val="400" w:hRule="atLeast"/>
+        </w:trPr>
+        <w:tc>
+          <w:tcPr>
+            <w:tcW w:type="dxa" w:w="1900"/>
+            <w:tcBorders>
+              <w:top w:val="none" w:color="FFFFFF" w:sz="0"/>
+              <w:left w:val="none" w:color="FFFFFF" w:sz="0"/>
+              <w:bottom w:val="none" w:color="FFFFFF" w:sz="0"/>
+              <w:right w:val="none" w:color="FFFFFF" w:sz="0"/>
+            </w:tcBorders>
+            <w:vAlign w:val="center"/>
+          </w:tcPr>
+          <w:p>
+            <w:pPr>
+              <w:bidi/>
+              <w:spacing w:after="30" w:before="30" w:line="300"/>
+            </w:pPr>
+            <w:r>
+              <w:rPr>
+                <w:rFonts w:ascii="Arial" w:cs="Arial" w:hAnsi="Arial"/>
+                <w:b/>
+                <w:bCs/>
+                <w:sz w:val="26"/>
+                <w:szCs w:val="26"/>
+                <w:rtl/>
+              </w:rPr>
+              <w:t xml:space="preserve">צורה 5</w:t>
+            </w:r>
+          </w:p>
+        </w:tc>
+        <w:tc>
+          <w:tcPr>
+            <w:tcW w:type="dxa" w:w="2001"/>
+            <w:tcBorders>
+              <w:top w:val="none" w:color="FFFFFF" w:sz="0"/>
+              <w:left w:val="none" w:color="FFFFFF" w:sz="0"/>
+              <w:bottom w:val="none" w:color="FFFFFF" w:sz="0"/>
+              <w:right w:val="none" w:color="FFFFFF" w:sz="0"/>
+            </w:tcBorders>
+            <w:vAlign w:val="center"/>
+          </w:tcPr>
+          <w:p>
+            <w:pPr>
+              <w:bidi/>
+              <w:spacing w:after="30" w:before="30" w:line="300"/>
+              <w:jc w:val="center"/>
+            </w:pPr>
+            <w:r>
+              <w:rPr>
+                <w:rFonts w:ascii="Arial" w:cs="Arial" w:hAnsi="Arial"/>
+                <w:sz w:val="26"/>
+                <w:szCs w:val="26"/>
+                <w:rtl/>
+              </w:rPr>
+              <w:t xml:space="preserve">משולש</w:t>
+            </w:r>
+          </w:p>
+        </w:tc>
+        <w:tc>
+          <w:tcPr>
+            <w:tcW w:type="dxa" w:w="2001"/>
+            <w:tcBorders>
+              <w:top w:val="none" w:color="FFFFFF" w:sz="0"/>
+              <w:left w:val="none" w:color="FFFFFF" w:sz="0"/>
+              <w:bottom w:val="none" w:color="FFFFFF" w:sz="0"/>
+              <w:right w:val="none" w:color="FFFFFF" w:sz="0"/>
+            </w:tcBorders>
+            <w:vAlign w:val="center"/>
+          </w:tcPr>
+          <w:p>
+            <w:pPr>
+              <w:bidi/>
+              <w:spacing w:after="30" w:before="30" w:line="300"/>
+              <w:jc w:val="center"/>
+            </w:pPr>
+            <w:r>
+              <w:rPr>
+                <w:rFonts w:ascii="Arial" w:cs="Arial" w:hAnsi="Arial"/>
+                <w:sz w:val="26"/>
+                <w:szCs w:val="26"/>
+                <w:rtl/>
+              </w:rPr>
+              <w:t xml:space="preserve">מרובע</w:t>
+            </w:r>
+          </w:p>
+        </w:tc>
+        <w:tc>
+          <w:tcPr>
+            <w:tcW w:type="dxa" w:w="2001"/>
+            <w:tcBorders>
+              <w:top w:val="none" w:color="FFFFFF" w:sz="0"/>
+              <w:left w:val="none" w:color="FFFFFF" w:sz="0"/>
+              <w:bottom w:val="none" w:color="FFFFFF" w:sz="0"/>
+              <w:right w:val="none" w:color="FFFFFF" w:sz="0"/>
+            </w:tcBorders>
+            <w:vAlign w:val="center"/>
+          </w:tcPr>
+          <w:p>
+            <w:pPr>
+              <w:bidi/>
+              <w:spacing w:after="30" w:before="30" w:line="300"/>
+              <w:jc w:val="center"/>
+            </w:pPr>
+            <w:r>
+              <w:rPr>
+                <w:rFonts w:ascii="Arial" w:cs="Arial" w:hAnsi="Arial"/>
+                <w:sz w:val="26"/>
+                <w:szCs w:val="26"/>
+                <w:rtl/>
+              </w:rPr>
+              <w:t xml:space="preserve">מחומש</w:t>
+            </w:r>
+          </w:p>
+        </w:tc>
+        <w:tc>
+          <w:tcPr>
+            <w:tcW w:type="dxa" w:w="2001"/>
+            <w:tcBorders>
+              <w:top w:val="none" w:color="FFFFFF" w:sz="0"/>
+              <w:left w:val="none" w:color="FFFFFF" w:sz="0"/>
+              <w:bottom w:val="none" w:color="FFFFFF" w:sz="0"/>
+              <w:right w:val="none" w:color="FFFFFF" w:sz="0"/>
+            </w:tcBorders>
+            <w:vAlign w:val="center"/>
+          </w:tcPr>
+          <w:p>
+            <w:pPr>
+              <w:bidi/>
+              <w:spacing w:after="30" w:before="30" w:line="300"/>
+              <w:jc w:val="center"/>
+            </w:pPr>
+            <w:r>
+              <w:rPr>
+                <w:rFonts w:ascii="Arial" w:cs="Arial" w:hAnsi="Arial"/>
+                <w:sz w:val="26"/>
+                <w:szCs w:val="26"/>
+                <w:rtl/>
+              </w:rPr>
+              <w:t xml:space="preserve">משושה</w:t>
+            </w:r>
           </w:p>
         </w:tc>
       </w:tr>
     </w:tbl>
     <w:p>
       <w:pPr>
+        <w:keepNext/>
         <w:bidi/>
         <w:spacing w:after="60" w:before="60" w:line="300"/>
       </w:pPr>
@@ -3704,11 +4102,239 @@
           <w:szCs w:val="26"/>
           <w:rtl/>
         </w:rPr>
-        <w:t xml:space="preserve">אילו צורות אינן מצולעים?  ________   למה?  ____________________________________</w:t>
+        <w:t xml:space="preserve">אילו צורות אינן מצולעים? (הקיפו שתי צורות)</w:t>
       </w:r>
     </w:p>
+    <w:tbl>
+      <w:tblPr>
+        <w:bidiVisual/>
+        <w:tblW w:type="dxa" w:w="9904"/>
+        <w:tblBorders>
+          <w:top w:val="none" w:color="FFFFFF" w:sz="0"/>
+          <w:left w:val="none" w:color="FFFFFF" w:sz="0"/>
+          <w:bottom w:val="none" w:color="FFFFFF" w:sz="0"/>
+          <w:right w:val="none" w:color="FFFFFF" w:sz="0"/>
+          <w:insideH w:val="none" w:color="FFFFFF" w:sz="0"/>
+          <w:insideV w:val="none" w:color="FFFFFF" w:sz="0"/>
+        </w:tblBorders>
+        <w:tblLayout w:type="fixed"/>
+      </w:tblPr>
+      <w:tblGrid>
+        <w:gridCol w:w="400"/>
+        <w:gridCol w:w="1584"/>
+        <w:gridCol w:w="1584"/>
+        <w:gridCol w:w="1584"/>
+        <w:gridCol w:w="1584"/>
+        <w:gridCol w:w="1584"/>
+        <w:gridCol w:w="1584"/>
+      </w:tblGrid>
+      <w:tr>
+        <w:trPr>
+          <w:cantSplit/>
+          <w:trHeight w:val="400" w:hRule="atLeast"/>
+        </w:trPr>
+        <w:tc>
+          <w:tcPr>
+            <w:tcW w:type="dxa" w:w="400"/>
+            <w:tcBorders>
+              <w:top w:val="none" w:color="FFFFFF" w:sz="0"/>
+              <w:left w:val="none" w:color="FFFFFF" w:sz="0"/>
+              <w:bottom w:val="none" w:color="FFFFFF" w:sz="0"/>
+              <w:right w:val="none" w:color="FFFFFF" w:sz="0"/>
+            </w:tcBorders>
+            <w:vAlign w:val="center"/>
+          </w:tcPr>
+          <w:p>
+            <w:pPr>
+              <w:bidi/>
+              <w:spacing w:after="30" w:before="30" w:line="300"/>
+            </w:pPr>
+            <w:r>
+              <w:rPr>
+                <w:rFonts w:ascii="Arial" w:cs="Arial" w:hAnsi="Arial"/>
+                <w:b/>
+                <w:bCs/>
+                <w:sz w:val="26"/>
+                <w:szCs w:val="26"/>
+                <w:rtl/>
+              </w:rPr>
+              <w:t xml:space="preserve"/>
+            </w:r>
+          </w:p>
+        </w:tc>
+        <w:tc>
+          <w:tcPr>
+            <w:tcW w:type="dxa" w:w="1584"/>
+            <w:tcBorders>
+              <w:top w:val="none" w:color="FFFFFF" w:sz="0"/>
+              <w:left w:val="none" w:color="FFFFFF" w:sz="0"/>
+              <w:bottom w:val="none" w:color="FFFFFF" w:sz="0"/>
+              <w:right w:val="none" w:color="FFFFFF" w:sz="0"/>
+            </w:tcBorders>
+            <w:vAlign w:val="center"/>
+          </w:tcPr>
+          <w:p>
+            <w:pPr>
+              <w:bidi/>
+              <w:spacing w:after="30" w:before="30" w:line="300"/>
+              <w:jc w:val="center"/>
+            </w:pPr>
+            <w:r>
+              <w:rPr>
+                <w:rFonts w:ascii="Arial" w:cs="Arial" w:hAnsi="Arial"/>
+                <w:sz w:val="26"/>
+                <w:szCs w:val="26"/>
+                <w:rtl/>
+              </w:rPr>
+              <w:t xml:space="preserve">1</w:t>
+            </w:r>
+          </w:p>
+        </w:tc>
+        <w:tc>
+          <w:tcPr>
+            <w:tcW w:type="dxa" w:w="1584"/>
+            <w:tcBorders>
+              <w:top w:val="none" w:color="FFFFFF" w:sz="0"/>
+              <w:left w:val="none" w:color="FFFFFF" w:sz="0"/>
+              <w:bottom w:val="none" w:color="FFFFFF" w:sz="0"/>
+              <w:right w:val="none" w:color="FFFFFF" w:sz="0"/>
+            </w:tcBorders>
+            <w:vAlign w:val="center"/>
+          </w:tcPr>
+          <w:p>
+            <w:pPr>
+              <w:bidi/>
+              <w:spacing w:after="30" w:before="30" w:line="300"/>
+              <w:jc w:val="center"/>
+            </w:pPr>
+            <w:r>
+              <w:rPr>
+                <w:rFonts w:ascii="Arial" w:cs="Arial" w:hAnsi="Arial"/>
+                <w:sz w:val="26"/>
+                <w:szCs w:val="26"/>
+                <w:rtl/>
+              </w:rPr>
+              <w:t xml:space="preserve">2</w:t>
+            </w:r>
+          </w:p>
+        </w:tc>
+        <w:tc>
+          <w:tcPr>
+            <w:tcW w:type="dxa" w:w="1584"/>
+            <w:tcBorders>
+              <w:top w:val="none" w:color="FFFFFF" w:sz="0"/>
+              <w:left w:val="none" w:color="FFFFFF" w:sz="0"/>
+              <w:bottom w:val="none" w:color="FFFFFF" w:sz="0"/>
+              <w:right w:val="none" w:color="FFFFFF" w:sz="0"/>
+            </w:tcBorders>
+            <w:vAlign w:val="center"/>
+          </w:tcPr>
+          <w:p>
+            <w:pPr>
+              <w:bidi/>
+              <w:spacing w:after="30" w:before="30" w:line="300"/>
+              <w:jc w:val="center"/>
+            </w:pPr>
+            <w:r>
+              <w:rPr>
+                <w:rFonts w:ascii="Arial" w:cs="Arial" w:hAnsi="Arial"/>
+                <w:sz w:val="26"/>
+                <w:szCs w:val="26"/>
+                <w:rtl/>
+              </w:rPr>
+              <w:t xml:space="preserve">3</w:t>
+            </w:r>
+          </w:p>
+        </w:tc>
+        <w:tc>
+          <w:tcPr>
+            <w:tcW w:type="dxa" w:w="1584"/>
+            <w:tcBorders>
+              <w:top w:val="none" w:color="FFFFFF" w:sz="0"/>
+              <w:left w:val="none" w:color="FFFFFF" w:sz="0"/>
+              <w:bottom w:val="none" w:color="FFFFFF" w:sz="0"/>
+              <w:right w:val="none" w:color="FFFFFF" w:sz="0"/>
+            </w:tcBorders>
+            <w:vAlign w:val="center"/>
+          </w:tcPr>
+          <w:p>
+            <w:pPr>
+              <w:bidi/>
+              <w:spacing w:after="30" w:before="30" w:line="300"/>
+              <w:jc w:val="center"/>
+            </w:pPr>
+            <w:r>
+              <w:rPr>
+                <w:rFonts w:ascii="Arial" w:cs="Arial" w:hAnsi="Arial"/>
+                <w:sz w:val="26"/>
+                <w:szCs w:val="26"/>
+                <w:rtl/>
+              </w:rPr>
+              <w:t xml:space="preserve">4</w:t>
+            </w:r>
+          </w:p>
+        </w:tc>
+        <w:tc>
+          <w:tcPr>
+            <w:tcW w:type="dxa" w:w="1584"/>
+            <w:tcBorders>
+              <w:top w:val="none" w:color="FFFFFF" w:sz="0"/>
+              <w:left w:val="none" w:color="FFFFFF" w:sz="0"/>
+              <w:bottom w:val="none" w:color="FFFFFF" w:sz="0"/>
+              <w:right w:val="none" w:color="FFFFFF" w:sz="0"/>
+            </w:tcBorders>
+            <w:vAlign w:val="center"/>
+          </w:tcPr>
+          <w:p>
+            <w:pPr>
+              <w:bidi/>
+              <w:spacing w:after="30" w:before="30" w:line="300"/>
+              <w:jc w:val="center"/>
+            </w:pPr>
+            <w:r>
+              <w:rPr>
+                <w:rFonts w:ascii="Arial" w:cs="Arial" w:hAnsi="Arial"/>
+                <w:sz w:val="26"/>
+                <w:szCs w:val="26"/>
+                <w:rtl/>
+              </w:rPr>
+              <w:t xml:space="preserve">5</w:t>
+            </w:r>
+          </w:p>
+        </w:tc>
+        <w:tc>
+          <w:tcPr>
+            <w:tcW w:type="dxa" w:w="1584"/>
+            <w:tcBorders>
+              <w:top w:val="none" w:color="FFFFFF" w:sz="0"/>
+              <w:left w:val="none" w:color="FFFFFF" w:sz="0"/>
+              <w:bottom w:val="none" w:color="FFFFFF" w:sz="0"/>
+              <w:right w:val="none" w:color="FFFFFF" w:sz="0"/>
+            </w:tcBorders>
+            <w:vAlign w:val="center"/>
+          </w:tcPr>
+          <w:p>
+            <w:pPr>
+              <w:bidi/>
+              <w:spacing w:after="30" w:before="30" w:line="300"/>
+              <w:jc w:val="center"/>
+            </w:pPr>
+            <w:r>
+              <w:rPr>
+                <w:rFonts w:ascii="Arial" w:cs="Arial" w:hAnsi="Arial"/>
+                <w:sz w:val="26"/>
+                <w:szCs w:val="26"/>
+                <w:rtl/>
+              </w:rPr>
+              <w:t xml:space="preserve">6</w:t>
+            </w:r>
+          </w:p>
+        </w:tc>
+      </w:tr>
+    </w:tbl>
     <w:p>
       <w:pPr>
+        <w:keepNext/>
         <w:bidi/>
         <w:spacing w:after="60" w:before="60" w:line="300"/>
       </w:pPr>
@@ -3722,7 +4348,7 @@
           <w:szCs w:val="26"/>
           <w:rtl/>
         </w:rPr>
-        <w:t xml:space="preserve">★  </w:t>
+        <w:t xml:space="preserve">★★  </w:t>
       </w:r>
       <w:r>
         <w:rPr>
@@ -3742,9 +4368,566 @@
           <w:szCs w:val="26"/>
           <w:rtl/>
         </w:rPr>
-        <w:t xml:space="preserve">למחומש יש ___ צלעות ו-___ קודקודים.   למשושה יש ___ צלעות.</w:t>
+        <w:t xml:space="preserve">למה הן אינן מצולעים?</w:t>
       </w:r>
     </w:p>
+    <w:tbl>
+      <w:tblPr>
+        <w:bidiVisual/>
+        <w:tblW w:type="dxa" w:w="9904"/>
+        <w:tblBorders>
+          <w:top w:val="none" w:color="FFFFFF" w:sz="0"/>
+          <w:left w:val="none" w:color="FFFFFF" w:sz="0"/>
+          <w:bottom w:val="none" w:color="FFFFFF" w:sz="0"/>
+          <w:right w:val="none" w:color="FFFFFF" w:sz="0"/>
+          <w:insideH w:val="none" w:color="FFFFFF" w:sz="0"/>
+          <w:insideV w:val="none" w:color="FFFFFF" w:sz="0"/>
+        </w:tblBorders>
+        <w:tblLayout w:type="fixed"/>
+      </w:tblPr>
+      <w:tblGrid>
+        <w:gridCol w:w="400"/>
+        <w:gridCol w:w="3168"/>
+        <w:gridCol w:w="3168"/>
+        <w:gridCol w:w="3168"/>
+      </w:tblGrid>
+      <w:tr>
+        <w:trPr>
+          <w:cantSplit/>
+          <w:trHeight w:val="400" w:hRule="atLeast"/>
+        </w:trPr>
+        <w:tc>
+          <w:tcPr>
+            <w:tcW w:type="dxa" w:w="400"/>
+            <w:tcBorders>
+              <w:top w:val="none" w:color="FFFFFF" w:sz="0"/>
+              <w:left w:val="none" w:color="FFFFFF" w:sz="0"/>
+              <w:bottom w:val="none" w:color="FFFFFF" w:sz="0"/>
+              <w:right w:val="none" w:color="FFFFFF" w:sz="0"/>
+            </w:tcBorders>
+            <w:vAlign w:val="center"/>
+          </w:tcPr>
+          <w:p>
+            <w:pPr>
+              <w:bidi/>
+              <w:spacing w:after="30" w:before="30" w:line="300"/>
+            </w:pPr>
+            <w:r>
+              <w:rPr>
+                <w:rFonts w:ascii="Arial" w:cs="Arial" w:hAnsi="Arial"/>
+                <w:b/>
+                <w:bCs/>
+                <w:sz w:val="26"/>
+                <w:szCs w:val="26"/>
+                <w:rtl/>
+              </w:rPr>
+              <w:t xml:space="preserve"/>
+            </w:r>
+          </w:p>
+        </w:tc>
+        <w:tc>
+          <w:tcPr>
+            <w:tcW w:type="dxa" w:w="3168"/>
+            <w:tcBorders>
+              <w:top w:val="none" w:color="FFFFFF" w:sz="0"/>
+              <w:left w:val="none" w:color="FFFFFF" w:sz="0"/>
+              <w:bottom w:val="none" w:color="FFFFFF" w:sz="0"/>
+              <w:right w:val="none" w:color="FFFFFF" w:sz="0"/>
+            </w:tcBorders>
+            <w:vAlign w:val="center"/>
+          </w:tcPr>
+          <w:p>
+            <w:pPr>
+              <w:bidi/>
+              <w:spacing w:after="30" w:before="30" w:line="300"/>
+              <w:jc w:val="center"/>
+            </w:pPr>
+            <w:r>
+              <w:rPr>
+                <w:rFonts w:ascii="Arial" w:cs="Arial" w:hAnsi="Arial"/>
+                <w:sz w:val="26"/>
+                <w:szCs w:val="26"/>
+                <w:rtl/>
+              </w:rPr>
+              <w:t xml:space="preserve">קו עגול או לא סגור</w:t>
+            </w:r>
+          </w:p>
+        </w:tc>
+        <w:tc>
+          <w:tcPr>
+            <w:tcW w:type="dxa" w:w="3168"/>
+            <w:tcBorders>
+              <w:top w:val="none" w:color="FFFFFF" w:sz="0"/>
+              <w:left w:val="none" w:color="FFFFFF" w:sz="0"/>
+              <w:bottom w:val="none" w:color="FFFFFF" w:sz="0"/>
+              <w:right w:val="none" w:color="FFFFFF" w:sz="0"/>
+            </w:tcBorders>
+            <w:vAlign w:val="center"/>
+          </w:tcPr>
+          <w:p>
+            <w:pPr>
+              <w:bidi/>
+              <w:spacing w:after="30" w:before="30" w:line="300"/>
+              <w:jc w:val="center"/>
+            </w:pPr>
+            <w:r>
+              <w:rPr>
+                <w:rFonts w:ascii="Arial" w:cs="Arial" w:hAnsi="Arial"/>
+                <w:sz w:val="26"/>
+                <w:szCs w:val="26"/>
+                <w:rtl/>
+              </w:rPr>
+              <w:t xml:space="preserve">יותר מ-4 צלעות</w:t>
+            </w:r>
+          </w:p>
+        </w:tc>
+        <w:tc>
+          <w:tcPr>
+            <w:tcW w:type="dxa" w:w="3168"/>
+            <w:tcBorders>
+              <w:top w:val="none" w:color="FFFFFF" w:sz="0"/>
+              <w:left w:val="none" w:color="FFFFFF" w:sz="0"/>
+              <w:bottom w:val="none" w:color="FFFFFF" w:sz="0"/>
+              <w:right w:val="none" w:color="FFFFFF" w:sz="0"/>
+            </w:tcBorders>
+            <w:vAlign w:val="center"/>
+          </w:tcPr>
+          <w:p>
+            <w:pPr>
+              <w:bidi/>
+              <w:spacing w:after="30" w:before="30" w:line="300"/>
+              <w:jc w:val="center"/>
+            </w:pPr>
+            <w:r>
+              <w:rPr>
+                <w:rFonts w:ascii="Arial" w:cs="Arial" w:hAnsi="Arial"/>
+                <w:sz w:val="26"/>
+                <w:szCs w:val="26"/>
+                <w:rtl/>
+              </w:rPr>
+              <w:t xml:space="preserve">אין להן פינות</w:t>
+            </w:r>
+          </w:p>
+        </w:tc>
+      </w:tr>
+    </w:tbl>
+    <w:p>
+      <w:pPr>
+        <w:keepNext/>
+        <w:bidi/>
+        <w:spacing w:after="60" w:before="60" w:line="300"/>
+      </w:pPr>
+      <w:r>
+        <w:rPr>
+          <w:rFonts w:ascii="Arial" w:cs="Arial" w:hAnsi="Arial"/>
+          <w:b/>
+          <w:bCs/>
+          <w:color w:val="C98A00"/>
+          <w:sz w:val="26"/>
+          <w:szCs w:val="26"/>
+          <w:rtl/>
+        </w:rPr>
+        <w:t xml:space="preserve">★  </w:t>
+      </w:r>
+      <w:r>
+        <w:rPr>
+          <w:rFonts w:ascii="Arial" w:cs="Arial" w:hAnsi="Arial"/>
+          <w:b/>
+          <w:bCs/>
+          <w:sz w:val="26"/>
+          <w:szCs w:val="26"/>
+          <w:rtl/>
+        </w:rPr>
+        <w:t xml:space="preserve">ד. </w:t>
+      </w:r>
+      <w:r>
+        <w:rPr>
+          <w:rFonts w:ascii="Arial" w:cs="Arial" w:hAnsi="Arial"/>
+          <w:sz w:val="26"/>
+          <w:szCs w:val="26"/>
+          <w:rtl/>
+        </w:rPr>
+        <w:t xml:space="preserve">כמה?</w:t>
+      </w:r>
+    </w:p>
+    <w:tbl>
+      <w:tblPr>
+        <w:bidiVisual/>
+        <w:tblW w:type="dxa" w:w="9905"/>
+        <w:tblBorders>
+          <w:top w:val="none" w:color="FFFFFF" w:sz="0"/>
+          <w:left w:val="none" w:color="FFFFFF" w:sz="0"/>
+          <w:bottom w:val="none" w:color="FFFFFF" w:sz="0"/>
+          <w:right w:val="none" w:color="FFFFFF" w:sz="0"/>
+          <w:insideH w:val="none" w:color="FFFFFF" w:sz="0"/>
+          <w:insideV w:val="none" w:color="FFFFFF" w:sz="0"/>
+        </w:tblBorders>
+        <w:tblLayout w:type="fixed"/>
+      </w:tblPr>
+      <w:tblGrid>
+        <w:gridCol w:w="2600"/>
+        <w:gridCol w:w="2435"/>
+        <w:gridCol w:w="2435"/>
+        <w:gridCol w:w="2435"/>
+      </w:tblGrid>
+      <w:tr>
+        <w:trPr>
+          <w:cantSplit/>
+          <w:trHeight w:val="400" w:hRule="atLeast"/>
+        </w:trPr>
+        <w:tc>
+          <w:tcPr>
+            <w:tcW w:type="dxa" w:w="2600"/>
+            <w:tcBorders>
+              <w:top w:val="none" w:color="FFFFFF" w:sz="0"/>
+              <w:left w:val="none" w:color="FFFFFF" w:sz="0"/>
+              <w:bottom w:val="none" w:color="FFFFFF" w:sz="0"/>
+              <w:right w:val="none" w:color="FFFFFF" w:sz="0"/>
+            </w:tcBorders>
+            <w:vAlign w:val="center"/>
+          </w:tcPr>
+          <w:p>
+            <w:pPr>
+              <w:bidi/>
+              <w:spacing w:after="30" w:before="30" w:line="300"/>
+            </w:pPr>
+            <w:r>
+              <w:rPr>
+                <w:rFonts w:ascii="Arial" w:cs="Arial" w:hAnsi="Arial"/>
+                <w:b/>
+                <w:bCs/>
+                <w:sz w:val="26"/>
+                <w:szCs w:val="26"/>
+                <w:rtl/>
+              </w:rPr>
+              <w:t xml:space="preserve">צלעות למחומש</w:t>
+            </w:r>
+          </w:p>
+        </w:tc>
+        <w:tc>
+          <w:tcPr>
+            <w:tcW w:type="dxa" w:w="2435"/>
+            <w:tcBorders>
+              <w:top w:val="none" w:color="FFFFFF" w:sz="0"/>
+              <w:left w:val="none" w:color="FFFFFF" w:sz="0"/>
+              <w:bottom w:val="none" w:color="FFFFFF" w:sz="0"/>
+              <w:right w:val="none" w:color="FFFFFF" w:sz="0"/>
+            </w:tcBorders>
+            <w:vAlign w:val="center"/>
+          </w:tcPr>
+          <w:p>
+            <w:pPr>
+              <w:bidi/>
+              <w:spacing w:after="30" w:before="30" w:line="300"/>
+              <w:jc w:val="center"/>
+            </w:pPr>
+            <w:r>
+              <w:rPr>
+                <w:rFonts w:ascii="Arial" w:cs="Arial" w:hAnsi="Arial"/>
+                <w:sz w:val="26"/>
+                <w:szCs w:val="26"/>
+                <w:rtl/>
+              </w:rPr>
+              <w:t xml:space="preserve">4</w:t>
+            </w:r>
+          </w:p>
+        </w:tc>
+        <w:tc>
+          <w:tcPr>
+            <w:tcW w:type="dxa" w:w="2435"/>
+            <w:tcBorders>
+              <w:top w:val="none" w:color="FFFFFF" w:sz="0"/>
+              <w:left w:val="none" w:color="FFFFFF" w:sz="0"/>
+              <w:bottom w:val="none" w:color="FFFFFF" w:sz="0"/>
+              <w:right w:val="none" w:color="FFFFFF" w:sz="0"/>
+            </w:tcBorders>
+            <w:vAlign w:val="center"/>
+          </w:tcPr>
+          <w:p>
+            <w:pPr>
+              <w:bidi/>
+              <w:spacing w:after="30" w:before="30" w:line="300"/>
+              <w:jc w:val="center"/>
+            </w:pPr>
+            <w:r>
+              <w:rPr>
+                <w:rFonts w:ascii="Arial" w:cs="Arial" w:hAnsi="Arial"/>
+                <w:sz w:val="26"/>
+                <w:szCs w:val="26"/>
+                <w:rtl/>
+              </w:rPr>
+              <w:t xml:space="preserve">5</w:t>
+            </w:r>
+          </w:p>
+        </w:tc>
+        <w:tc>
+          <w:tcPr>
+            <w:tcW w:type="dxa" w:w="2435"/>
+            <w:tcBorders>
+              <w:top w:val="none" w:color="FFFFFF" w:sz="0"/>
+              <w:left w:val="none" w:color="FFFFFF" w:sz="0"/>
+              <w:bottom w:val="none" w:color="FFFFFF" w:sz="0"/>
+              <w:right w:val="none" w:color="FFFFFF" w:sz="0"/>
+            </w:tcBorders>
+            <w:vAlign w:val="center"/>
+          </w:tcPr>
+          <w:p>
+            <w:pPr>
+              <w:bidi/>
+              <w:spacing w:after="30" w:before="30" w:line="300"/>
+              <w:jc w:val="center"/>
+            </w:pPr>
+            <w:r>
+              <w:rPr>
+                <w:rFonts w:ascii="Arial" w:cs="Arial" w:hAnsi="Arial"/>
+                <w:sz w:val="26"/>
+                <w:szCs w:val="26"/>
+                <w:rtl/>
+              </w:rPr>
+              <w:t xml:space="preserve">6</w:t>
+            </w:r>
+          </w:p>
+        </w:tc>
+      </w:tr>
+      <w:tr>
+        <w:trPr>
+          <w:cantSplit/>
+          <w:trHeight w:val="400" w:hRule="atLeast"/>
+        </w:trPr>
+        <w:tc>
+          <w:tcPr>
+            <w:tcW w:type="dxa" w:w="2600"/>
+            <w:tcBorders>
+              <w:top w:val="none" w:color="FFFFFF" w:sz="0"/>
+              <w:left w:val="none" w:color="FFFFFF" w:sz="0"/>
+              <w:bottom w:val="none" w:color="FFFFFF" w:sz="0"/>
+              <w:right w:val="none" w:color="FFFFFF" w:sz="0"/>
+            </w:tcBorders>
+            <w:vAlign w:val="center"/>
+          </w:tcPr>
+          <w:p>
+            <w:pPr>
+              <w:bidi/>
+              <w:spacing w:after="30" w:before="30" w:line="300"/>
+            </w:pPr>
+            <w:r>
+              <w:rPr>
+                <w:rFonts w:ascii="Arial" w:cs="Arial" w:hAnsi="Arial"/>
+                <w:b/>
+                <w:bCs/>
+                <w:sz w:val="26"/>
+                <w:szCs w:val="26"/>
+                <w:rtl/>
+              </w:rPr>
+              <w:t xml:space="preserve">קודקודים למחומש</w:t>
+            </w:r>
+          </w:p>
+        </w:tc>
+        <w:tc>
+          <w:tcPr>
+            <w:tcW w:type="dxa" w:w="2435"/>
+            <w:tcBorders>
+              <w:top w:val="none" w:color="FFFFFF" w:sz="0"/>
+              <w:left w:val="none" w:color="FFFFFF" w:sz="0"/>
+              <w:bottom w:val="none" w:color="FFFFFF" w:sz="0"/>
+              <w:right w:val="none" w:color="FFFFFF" w:sz="0"/>
+            </w:tcBorders>
+            <w:vAlign w:val="center"/>
+          </w:tcPr>
+          <w:p>
+            <w:pPr>
+              <w:bidi/>
+              <w:spacing w:after="30" w:before="30" w:line="300"/>
+              <w:jc w:val="center"/>
+            </w:pPr>
+            <w:r>
+              <w:rPr>
+                <w:rFonts w:ascii="Arial" w:cs="Arial" w:hAnsi="Arial"/>
+                <w:sz w:val="26"/>
+                <w:szCs w:val="26"/>
+                <w:rtl/>
+              </w:rPr>
+              <w:t xml:space="preserve">4</w:t>
+            </w:r>
+          </w:p>
+        </w:tc>
+        <w:tc>
+          <w:tcPr>
+            <w:tcW w:type="dxa" w:w="2435"/>
+            <w:tcBorders>
+              <w:top w:val="none" w:color="FFFFFF" w:sz="0"/>
+              <w:left w:val="none" w:color="FFFFFF" w:sz="0"/>
+              <w:bottom w:val="none" w:color="FFFFFF" w:sz="0"/>
+              <w:right w:val="none" w:color="FFFFFF" w:sz="0"/>
+            </w:tcBorders>
+            <w:vAlign w:val="center"/>
+          </w:tcPr>
+          <w:p>
+            <w:pPr>
+              <w:bidi/>
+              <w:spacing w:after="30" w:before="30" w:line="300"/>
+              <w:jc w:val="center"/>
+            </w:pPr>
+            <w:r>
+              <w:rPr>
+                <w:rFonts w:ascii="Arial" w:cs="Arial" w:hAnsi="Arial"/>
+                <w:sz w:val="26"/>
+                <w:szCs w:val="26"/>
+                <w:rtl/>
+              </w:rPr>
+              <w:t xml:space="preserve">5</w:t>
+            </w:r>
+          </w:p>
+        </w:tc>
+        <w:tc>
+          <w:tcPr>
+            <w:tcW w:type="dxa" w:w="2435"/>
+            <w:tcBorders>
+              <w:top w:val="none" w:color="FFFFFF" w:sz="0"/>
+              <w:left w:val="none" w:color="FFFFFF" w:sz="0"/>
+              <w:bottom w:val="none" w:color="FFFFFF" w:sz="0"/>
+              <w:right w:val="none" w:color="FFFFFF" w:sz="0"/>
+            </w:tcBorders>
+            <w:vAlign w:val="center"/>
+          </w:tcPr>
+          <w:p>
+            <w:pPr>
+              <w:bidi/>
+              <w:spacing w:after="30" w:before="30" w:line="300"/>
+              <w:jc w:val="center"/>
+            </w:pPr>
+            <w:r>
+              <w:rPr>
+                <w:rFonts w:ascii="Arial" w:cs="Arial" w:hAnsi="Arial"/>
+                <w:sz w:val="26"/>
+                <w:szCs w:val="26"/>
+                <w:rtl/>
+              </w:rPr>
+              <w:t xml:space="preserve">6</w:t>
+            </w:r>
+          </w:p>
+        </w:tc>
+      </w:tr>
+      <w:tr>
+        <w:trPr>
+          <w:cantSplit/>
+          <w:trHeight w:val="400" w:hRule="atLeast"/>
+        </w:trPr>
+        <w:tc>
+          <w:tcPr>
+            <w:tcW w:type="dxa" w:w="2600"/>
+            <w:tcBorders>
+              <w:top w:val="none" w:color="FFFFFF" w:sz="0"/>
+              <w:left w:val="none" w:color="FFFFFF" w:sz="0"/>
+              <w:bottom w:val="none" w:color="FFFFFF" w:sz="0"/>
+              <w:right w:val="none" w:color="FFFFFF" w:sz="0"/>
+            </w:tcBorders>
+            <w:vAlign w:val="center"/>
+          </w:tcPr>
+          <w:p>
+            <w:pPr>
+              <w:bidi/>
+              <w:spacing w:after="30" w:before="30" w:line="300"/>
+            </w:pPr>
+            <w:r>
+              <w:rPr>
+                <w:rFonts w:ascii="Arial" w:cs="Arial" w:hAnsi="Arial"/>
+                <w:b/>
+                <w:bCs/>
+                <w:sz w:val="26"/>
+                <w:szCs w:val="26"/>
+                <w:rtl/>
+              </w:rPr>
+              <w:t xml:space="preserve">צלעות למשושה</w:t>
+            </w:r>
+          </w:p>
+        </w:tc>
+        <w:tc>
+          <w:tcPr>
+            <w:tcW w:type="dxa" w:w="2435"/>
+            <w:tcBorders>
+              <w:top w:val="none" w:color="FFFFFF" w:sz="0"/>
+              <w:left w:val="none" w:color="FFFFFF" w:sz="0"/>
+              <w:bottom w:val="none" w:color="FFFFFF" w:sz="0"/>
+              <w:right w:val="none" w:color="FFFFFF" w:sz="0"/>
+            </w:tcBorders>
+            <w:vAlign w:val="center"/>
+          </w:tcPr>
+          <w:p>
+            <w:pPr>
+              <w:bidi/>
+              <w:spacing w:after="30" w:before="30" w:line="300"/>
+              <w:jc w:val="center"/>
+            </w:pPr>
+            <w:r>
+              <w:rPr>
+                <w:rFonts w:ascii="Arial" w:cs="Arial" w:hAnsi="Arial"/>
+                <w:sz w:val="26"/>
+                <w:szCs w:val="26"/>
+                <w:rtl/>
+              </w:rPr>
+              <w:t xml:space="preserve">5</w:t>
+            </w:r>
+          </w:p>
+        </w:tc>
+        <w:tc>
+          <w:tcPr>
+            <w:tcW w:type="dxa" w:w="2435"/>
+            <w:tcBorders>
+              <w:top w:val="none" w:color="FFFFFF" w:sz="0"/>
+              <w:left w:val="none" w:color="FFFFFF" w:sz="0"/>
+              <w:bottom w:val="none" w:color="FFFFFF" w:sz="0"/>
+              <w:right w:val="none" w:color="FFFFFF" w:sz="0"/>
+            </w:tcBorders>
+            <w:vAlign w:val="center"/>
+          </w:tcPr>
+          <w:p>
+            <w:pPr>
+              <w:bidi/>
+              <w:spacing w:after="30" w:before="30" w:line="300"/>
+              <w:jc w:val="center"/>
+            </w:pPr>
+            <w:r>
+              <w:rPr>
+                <w:rFonts w:ascii="Arial" w:cs="Arial" w:hAnsi="Arial"/>
+                <w:sz w:val="26"/>
+                <w:szCs w:val="26"/>
+                <w:rtl/>
+              </w:rPr>
+              <w:t xml:space="preserve">6</w:t>
+            </w:r>
+          </w:p>
+        </w:tc>
+        <w:tc>
+          <w:tcPr>
+            <w:tcW w:type="dxa" w:w="2435"/>
+            <w:tcBorders>
+              <w:top w:val="none" w:color="FFFFFF" w:sz="0"/>
+              <w:left w:val="none" w:color="FFFFFF" w:sz="0"/>
+              <w:bottom w:val="none" w:color="FFFFFF" w:sz="0"/>
+              <w:right w:val="none" w:color="FFFFFF" w:sz="0"/>
+            </w:tcBorders>
+            <w:vAlign w:val="center"/>
+          </w:tcPr>
+          <w:p>
+            <w:pPr>
+              <w:bidi/>
+              <w:spacing w:after="30" w:before="30" w:line="300"/>
+              <w:jc w:val="center"/>
+            </w:pPr>
+            <w:r>
+              <w:rPr>
+                <w:rFonts w:ascii="Arial" w:cs="Arial" w:hAnsi="Arial"/>
+                <w:sz w:val="26"/>
+                <w:szCs w:val="26"/>
+                <w:rtl/>
+              </w:rPr>
+              <w:t xml:space="preserve">8</w:t>
+            </w:r>
+          </w:p>
+        </w:tc>
+      </w:tr>
+    </w:tbl>
     <w:p>
       <w:pPr>
         <w:keepNext/>
@@ -3752,7 +4935,7 @@
           <w:bottom w:val="single" w:color="C9D3E6" w:sz="4" w:space="2"/>
         </w:pBdr>
         <w:bidi/>
-        <w:spacing w:after="80" w:before="260"/>
+        <w:spacing w:after="60" w:before="200"/>
       </w:pPr>
       <w:r>
         <w:rPr>
@@ -3780,7 +4963,7 @@
           <w:szCs w:val="26"/>
           <w:rtl/>
         </w:rPr>
-        <w:t xml:space="preserve">אורכי הצלעות כתובים בסנטימטרים.</w:t>
+        <w:t xml:space="preserve">אורכי הצלעות כתובים בסנטימטרים. הקיפו בעיגול את התשובה הנכונה.</w:t>
       </w:r>
     </w:p>
     <w:p>
@@ -3792,7 +4975,7 @@
       <w:r>
         <w:drawing>
           <wp:inline distT="0" distB="0" distL="0" distR="0">
-            <wp:extent cx="4476750" cy="1428750"/>
+            <wp:extent cx="3810000" cy="1219200"/>
             <wp:effectExtent t="0" r="0" b="0" l="0"/>
             <wp:docPr id="3" name="" descr="" title=""/>
             <wp:cNvGraphicFramePr>
@@ -3817,7 +5000,7 @@
                   <pic:spPr bwMode="auto">
                     <a:xfrm>
                       <a:off x="0" y="0"/>
-                      <a:ext cx="4476750" cy="1428750"/>
+                      <a:ext cx="3810000" cy="1219200"/>
                     </a:xfrm>
                     <a:prstGeom prst="rect">
                       <a:avLst/>
@@ -3866,50 +5049,49 @@
           <w:szCs w:val="26"/>
           <w:rtl/>
         </w:rPr>
-        <w:t xml:space="preserve">כתבו את סוג כל משולש: שווה צלעות, שווה שוקיים או שונה צלעות.</w:t>
+        <w:t xml:space="preserve">מה הסוג של כל משולש?</w:t>
       </w:r>
     </w:p>
     <w:tbl>
       <w:tblPr>
         <w:bidiVisual/>
-        <w:tblW w:type="dxa" w:w="7800"/>
-        <w:jc w:val="center"/>
+        <w:tblW w:type="dxa" w:w="9904"/>
         <w:tblBorders>
-          <w:top w:val="single" w:color="auto" w:sz="4"/>
-          <w:left w:val="single" w:color="auto" w:sz="4"/>
-          <w:bottom w:val="single" w:color="auto" w:sz="4"/>
-          <w:right w:val="single" w:color="auto" w:sz="4"/>
-          <w:insideH w:val="single" w:color="auto" w:sz="4"/>
-          <w:insideV w:val="single" w:color="auto" w:sz="4"/>
+          <w:top w:val="none" w:color="FFFFFF" w:sz="0"/>
+          <w:left w:val="none" w:color="FFFFFF" w:sz="0"/>
+          <w:bottom w:val="none" w:color="FFFFFF" w:sz="0"/>
+          <w:right w:val="none" w:color="FFFFFF" w:sz="0"/>
+          <w:insideH w:val="none" w:color="FFFFFF" w:sz="0"/>
+          <w:insideV w:val="none" w:color="FFFFFF" w:sz="0"/>
         </w:tblBorders>
         <w:tblLayout w:type="fixed"/>
       </w:tblPr>
       <w:tblGrid>
-        <w:gridCol w:w="2600"/>
-        <w:gridCol w:w="2600"/>
-        <w:gridCol w:w="2600"/>
+        <w:gridCol w:w="1900"/>
+        <w:gridCol w:w="2668"/>
+        <w:gridCol w:w="2668"/>
+        <w:gridCol w:w="2668"/>
       </w:tblGrid>
       <w:tr>
         <w:trPr>
-          <w:trHeight w:val="420" w:hRule="atLeast"/>
+          <w:cantSplit/>
+          <w:trHeight w:val="400" w:hRule="atLeast"/>
         </w:trPr>
         <w:tc>
           <w:tcPr>
-            <w:tcW w:type="dxa" w:w="2600"/>
-            <w:tcBorders>
-              <w:top w:val="single" w:color="777777" w:sz="6"/>
-              <w:left w:val="single" w:color="777777" w:sz="6"/>
-              <w:bottom w:val="single" w:color="777777" w:sz="6"/>
-              <w:right w:val="single" w:color="777777" w:sz="6"/>
-            </w:tcBorders>
-            <w:shd w:fill="EEF2F8" w:color="auto" w:val="clear"/>
-            <w:vAlign w:val="center"/>
-          </w:tcPr>
-          <w:p>
-            <w:pPr>
-              <w:bidi/>
-              <w:spacing w:after="40" w:before="40" w:line="300"/>
-              <w:jc w:val="center"/>
+            <w:tcW w:type="dxa" w:w="1900"/>
+            <w:tcBorders>
+              <w:top w:val="none" w:color="FFFFFF" w:sz="0"/>
+              <w:left w:val="none" w:color="FFFFFF" w:sz="0"/>
+              <w:bottom w:val="none" w:color="FFFFFF" w:sz="0"/>
+              <w:right w:val="none" w:color="FFFFFF" w:sz="0"/>
+            </w:tcBorders>
+            <w:vAlign w:val="center"/>
+          </w:tcPr>
+          <w:p>
+            <w:pPr>
+              <w:bidi/>
+              <w:spacing w:after="30" w:before="30" w:line="300"/>
             </w:pPr>
             <w:r>
               <w:rPr>
@@ -3926,132 +5108,331 @@
         </w:tc>
         <w:tc>
           <w:tcPr>
-            <w:tcW w:type="dxa" w:w="2600"/>
-            <w:tcBorders>
-              <w:top w:val="single" w:color="777777" w:sz="6"/>
-              <w:left w:val="single" w:color="777777" w:sz="6"/>
-              <w:bottom w:val="single" w:color="777777" w:sz="6"/>
-              <w:right w:val="single" w:color="777777" w:sz="6"/>
-            </w:tcBorders>
-            <w:shd w:fill="EEF2F8" w:color="auto" w:val="clear"/>
-            <w:vAlign w:val="center"/>
-          </w:tcPr>
-          <w:p>
-            <w:pPr>
-              <w:bidi/>
-              <w:spacing w:after="40" w:before="40" w:line="300"/>
-              <w:jc w:val="center"/>
-            </w:pPr>
-            <w:r>
-              <w:rPr>
-                <w:rFonts w:ascii="Arial" w:cs="Arial" w:hAnsi="Arial"/>
-                <w:b/>
-                <w:bCs/>
-                <w:sz w:val="26"/>
-                <w:szCs w:val="26"/>
-                <w:rtl/>
-              </w:rPr>
-              <w:t xml:space="preserve">משולש ב</w:t>
-            </w:r>
-          </w:p>
-        </w:tc>
-        <w:tc>
-          <w:tcPr>
-            <w:tcW w:type="dxa" w:w="2600"/>
-            <w:tcBorders>
-              <w:top w:val="single" w:color="777777" w:sz="6"/>
-              <w:left w:val="single" w:color="777777" w:sz="6"/>
-              <w:bottom w:val="single" w:color="777777" w:sz="6"/>
-              <w:right w:val="single" w:color="777777" w:sz="6"/>
-            </w:tcBorders>
-            <w:shd w:fill="EEF2F8" w:color="auto" w:val="clear"/>
-            <w:vAlign w:val="center"/>
-          </w:tcPr>
-          <w:p>
-            <w:pPr>
-              <w:bidi/>
-              <w:spacing w:after="40" w:before="40" w:line="300"/>
-              <w:jc w:val="center"/>
-            </w:pPr>
-            <w:r>
-              <w:rPr>
-                <w:rFonts w:ascii="Arial" w:cs="Arial" w:hAnsi="Arial"/>
-                <w:b/>
-                <w:bCs/>
-                <w:sz w:val="26"/>
-                <w:szCs w:val="26"/>
-                <w:rtl/>
-              </w:rPr>
-              <w:t xml:space="preserve">משולש ג</w:t>
+            <w:tcW w:type="dxa" w:w="2668"/>
+            <w:tcBorders>
+              <w:top w:val="none" w:color="FFFFFF" w:sz="0"/>
+              <w:left w:val="none" w:color="FFFFFF" w:sz="0"/>
+              <w:bottom w:val="none" w:color="FFFFFF" w:sz="0"/>
+              <w:right w:val="none" w:color="FFFFFF" w:sz="0"/>
+            </w:tcBorders>
+            <w:vAlign w:val="center"/>
+          </w:tcPr>
+          <w:p>
+            <w:pPr>
+              <w:bidi/>
+              <w:spacing w:after="30" w:before="30" w:line="300"/>
+              <w:jc w:val="center"/>
+            </w:pPr>
+            <w:r>
+              <w:rPr>
+                <w:rFonts w:ascii="Arial" w:cs="Arial" w:hAnsi="Arial"/>
+                <w:sz w:val="26"/>
+                <w:szCs w:val="26"/>
+                <w:rtl/>
+              </w:rPr>
+              <w:t xml:space="preserve">שווה צלעות</w:t>
+            </w:r>
+          </w:p>
+        </w:tc>
+        <w:tc>
+          <w:tcPr>
+            <w:tcW w:type="dxa" w:w="2668"/>
+            <w:tcBorders>
+              <w:top w:val="none" w:color="FFFFFF" w:sz="0"/>
+              <w:left w:val="none" w:color="FFFFFF" w:sz="0"/>
+              <w:bottom w:val="none" w:color="FFFFFF" w:sz="0"/>
+              <w:right w:val="none" w:color="FFFFFF" w:sz="0"/>
+            </w:tcBorders>
+            <w:vAlign w:val="center"/>
+          </w:tcPr>
+          <w:p>
+            <w:pPr>
+              <w:bidi/>
+              <w:spacing w:after="30" w:before="30" w:line="300"/>
+              <w:jc w:val="center"/>
+            </w:pPr>
+            <w:r>
+              <w:rPr>
+                <w:rFonts w:ascii="Arial" w:cs="Arial" w:hAnsi="Arial"/>
+                <w:sz w:val="26"/>
+                <w:szCs w:val="26"/>
+                <w:rtl/>
+              </w:rPr>
+              <w:t xml:space="preserve">שווה שוקיים</w:t>
+            </w:r>
+          </w:p>
+        </w:tc>
+        <w:tc>
+          <w:tcPr>
+            <w:tcW w:type="dxa" w:w="2668"/>
+            <w:tcBorders>
+              <w:top w:val="none" w:color="FFFFFF" w:sz="0"/>
+              <w:left w:val="none" w:color="FFFFFF" w:sz="0"/>
+              <w:bottom w:val="none" w:color="FFFFFF" w:sz="0"/>
+              <w:right w:val="none" w:color="FFFFFF" w:sz="0"/>
+            </w:tcBorders>
+            <w:vAlign w:val="center"/>
+          </w:tcPr>
+          <w:p>
+            <w:pPr>
+              <w:bidi/>
+              <w:spacing w:after="30" w:before="30" w:line="300"/>
+              <w:jc w:val="center"/>
+            </w:pPr>
+            <w:r>
+              <w:rPr>
+                <w:rFonts w:ascii="Arial" w:cs="Arial" w:hAnsi="Arial"/>
+                <w:sz w:val="26"/>
+                <w:szCs w:val="26"/>
+                <w:rtl/>
+              </w:rPr>
+              <w:t xml:space="preserve">שונה צלעות</w:t>
             </w:r>
           </w:p>
         </w:tc>
       </w:tr>
       <w:tr>
         <w:trPr>
-          <w:trHeight w:val="560" w:hRule="atLeast"/>
+          <w:cantSplit/>
+          <w:trHeight w:val="400" w:hRule="atLeast"/>
         </w:trPr>
         <w:tc>
           <w:tcPr>
-            <w:tcW w:type="dxa" w:w="2600"/>
-            <w:tcBorders>
-              <w:top w:val="single" w:color="777777" w:sz="6"/>
-              <w:left w:val="single" w:color="777777" w:sz="6"/>
-              <w:bottom w:val="single" w:color="777777" w:sz="6"/>
-              <w:right w:val="single" w:color="777777" w:sz="6"/>
-            </w:tcBorders>
-            <w:vAlign w:val="center"/>
-          </w:tcPr>
-          <w:p>
-            <w:pPr>
-              <w:bidi/>
-              <w:spacing w:after="40" w:before="40" w:line="300"/>
-              <w:jc w:val="center"/>
-            </w:pPr>
-          </w:p>
-        </w:tc>
-        <w:tc>
-          <w:tcPr>
-            <w:tcW w:type="dxa" w:w="2600"/>
-            <w:tcBorders>
-              <w:top w:val="single" w:color="777777" w:sz="6"/>
-              <w:left w:val="single" w:color="777777" w:sz="6"/>
-              <w:bottom w:val="single" w:color="777777" w:sz="6"/>
-              <w:right w:val="single" w:color="777777" w:sz="6"/>
-            </w:tcBorders>
-            <w:vAlign w:val="center"/>
-          </w:tcPr>
-          <w:p>
-            <w:pPr>
-              <w:bidi/>
-              <w:spacing w:after="40" w:before="40" w:line="300"/>
-              <w:jc w:val="center"/>
-            </w:pPr>
-          </w:p>
-        </w:tc>
-        <w:tc>
-          <w:tcPr>
-            <w:tcW w:type="dxa" w:w="2600"/>
-            <w:tcBorders>
-              <w:top w:val="single" w:color="777777" w:sz="6"/>
-              <w:left w:val="single" w:color="777777" w:sz="6"/>
-              <w:bottom w:val="single" w:color="777777" w:sz="6"/>
-              <w:right w:val="single" w:color="777777" w:sz="6"/>
-            </w:tcBorders>
-            <w:vAlign w:val="center"/>
-          </w:tcPr>
-          <w:p>
-            <w:pPr>
-              <w:bidi/>
-              <w:spacing w:after="40" w:before="40" w:line="300"/>
-              <w:jc w:val="center"/>
-            </w:pPr>
+            <w:tcW w:type="dxa" w:w="1900"/>
+            <w:tcBorders>
+              <w:top w:val="none" w:color="FFFFFF" w:sz="0"/>
+              <w:left w:val="none" w:color="FFFFFF" w:sz="0"/>
+              <w:bottom w:val="none" w:color="FFFFFF" w:sz="0"/>
+              <w:right w:val="none" w:color="FFFFFF" w:sz="0"/>
+            </w:tcBorders>
+            <w:vAlign w:val="center"/>
+          </w:tcPr>
+          <w:p>
+            <w:pPr>
+              <w:bidi/>
+              <w:spacing w:after="30" w:before="30" w:line="300"/>
+            </w:pPr>
+            <w:r>
+              <w:rPr>
+                <w:rFonts w:ascii="Arial" w:cs="Arial" w:hAnsi="Arial"/>
+                <w:b/>
+                <w:bCs/>
+                <w:sz w:val="26"/>
+                <w:szCs w:val="26"/>
+                <w:rtl/>
+              </w:rPr>
+              <w:t xml:space="preserve">משולש ב</w:t>
+            </w:r>
+          </w:p>
+        </w:tc>
+        <w:tc>
+          <w:tcPr>
+            <w:tcW w:type="dxa" w:w="2668"/>
+            <w:tcBorders>
+              <w:top w:val="none" w:color="FFFFFF" w:sz="0"/>
+              <w:left w:val="none" w:color="FFFFFF" w:sz="0"/>
+              <w:bottom w:val="none" w:color="FFFFFF" w:sz="0"/>
+              <w:right w:val="none" w:color="FFFFFF" w:sz="0"/>
+            </w:tcBorders>
+            <w:vAlign w:val="center"/>
+          </w:tcPr>
+          <w:p>
+            <w:pPr>
+              <w:bidi/>
+              <w:spacing w:after="30" w:before="30" w:line="300"/>
+              <w:jc w:val="center"/>
+            </w:pPr>
+            <w:r>
+              <w:rPr>
+                <w:rFonts w:ascii="Arial" w:cs="Arial" w:hAnsi="Arial"/>
+                <w:sz w:val="26"/>
+                <w:szCs w:val="26"/>
+                <w:rtl/>
+              </w:rPr>
+              <w:t xml:space="preserve">שווה צלעות</w:t>
+            </w:r>
+          </w:p>
+        </w:tc>
+        <w:tc>
+          <w:tcPr>
+            <w:tcW w:type="dxa" w:w="2668"/>
+            <w:tcBorders>
+              <w:top w:val="none" w:color="FFFFFF" w:sz="0"/>
+              <w:left w:val="none" w:color="FFFFFF" w:sz="0"/>
+              <w:bottom w:val="none" w:color="FFFFFF" w:sz="0"/>
+              <w:right w:val="none" w:color="FFFFFF" w:sz="0"/>
+            </w:tcBorders>
+            <w:vAlign w:val="center"/>
+          </w:tcPr>
+          <w:p>
+            <w:pPr>
+              <w:bidi/>
+              <w:spacing w:after="30" w:before="30" w:line="300"/>
+              <w:jc w:val="center"/>
+            </w:pPr>
+            <w:r>
+              <w:rPr>
+                <w:rFonts w:ascii="Arial" w:cs="Arial" w:hAnsi="Arial"/>
+                <w:sz w:val="26"/>
+                <w:szCs w:val="26"/>
+                <w:rtl/>
+              </w:rPr>
+              <w:t xml:space="preserve">שווה שוקיים</w:t>
+            </w:r>
+          </w:p>
+        </w:tc>
+        <w:tc>
+          <w:tcPr>
+            <w:tcW w:type="dxa" w:w="2668"/>
+            <w:tcBorders>
+              <w:top w:val="none" w:color="FFFFFF" w:sz="0"/>
+              <w:left w:val="none" w:color="FFFFFF" w:sz="0"/>
+              <w:bottom w:val="none" w:color="FFFFFF" w:sz="0"/>
+              <w:right w:val="none" w:color="FFFFFF" w:sz="0"/>
+            </w:tcBorders>
+            <w:vAlign w:val="center"/>
+          </w:tcPr>
+          <w:p>
+            <w:pPr>
+              <w:bidi/>
+              <w:spacing w:after="30" w:before="30" w:line="300"/>
+              <w:jc w:val="center"/>
+            </w:pPr>
+            <w:r>
+              <w:rPr>
+                <w:rFonts w:ascii="Arial" w:cs="Arial" w:hAnsi="Arial"/>
+                <w:sz w:val="26"/>
+                <w:szCs w:val="26"/>
+                <w:rtl/>
+              </w:rPr>
+              <w:t xml:space="preserve">שונה צלעות</w:t>
+            </w:r>
+          </w:p>
+        </w:tc>
+      </w:tr>
+      <w:tr>
+        <w:trPr>
+          <w:cantSplit/>
+          <w:trHeight w:val="400" w:hRule="atLeast"/>
+        </w:trPr>
+        <w:tc>
+          <w:tcPr>
+            <w:tcW w:type="dxa" w:w="1900"/>
+            <w:tcBorders>
+              <w:top w:val="none" w:color="FFFFFF" w:sz="0"/>
+              <w:left w:val="none" w:color="FFFFFF" w:sz="0"/>
+              <w:bottom w:val="none" w:color="FFFFFF" w:sz="0"/>
+              <w:right w:val="none" w:color="FFFFFF" w:sz="0"/>
+            </w:tcBorders>
+            <w:vAlign w:val="center"/>
+          </w:tcPr>
+          <w:p>
+            <w:pPr>
+              <w:bidi/>
+              <w:spacing w:after="30" w:before="30" w:line="300"/>
+            </w:pPr>
+            <w:r>
+              <w:rPr>
+                <w:rFonts w:ascii="Arial" w:cs="Arial" w:hAnsi="Arial"/>
+                <w:b/>
+                <w:bCs/>
+                <w:sz w:val="26"/>
+                <w:szCs w:val="26"/>
+                <w:rtl/>
+              </w:rPr>
+              <w:t xml:space="preserve">משולש ג</w:t>
+            </w:r>
+          </w:p>
+        </w:tc>
+        <w:tc>
+          <w:tcPr>
+            <w:tcW w:type="dxa" w:w="2668"/>
+            <w:tcBorders>
+              <w:top w:val="none" w:color="FFFFFF" w:sz="0"/>
+              <w:left w:val="none" w:color="FFFFFF" w:sz="0"/>
+              <w:bottom w:val="none" w:color="FFFFFF" w:sz="0"/>
+              <w:right w:val="none" w:color="FFFFFF" w:sz="0"/>
+            </w:tcBorders>
+            <w:vAlign w:val="center"/>
+          </w:tcPr>
+          <w:p>
+            <w:pPr>
+              <w:bidi/>
+              <w:spacing w:after="30" w:before="30" w:line="300"/>
+              <w:jc w:val="center"/>
+            </w:pPr>
+            <w:r>
+              <w:rPr>
+                <w:rFonts w:ascii="Arial" w:cs="Arial" w:hAnsi="Arial"/>
+                <w:sz w:val="26"/>
+                <w:szCs w:val="26"/>
+                <w:rtl/>
+              </w:rPr>
+              <w:t xml:space="preserve">שווה צלעות</w:t>
+            </w:r>
+          </w:p>
+        </w:tc>
+        <w:tc>
+          <w:tcPr>
+            <w:tcW w:type="dxa" w:w="2668"/>
+            <w:tcBorders>
+              <w:top w:val="none" w:color="FFFFFF" w:sz="0"/>
+              <w:left w:val="none" w:color="FFFFFF" w:sz="0"/>
+              <w:bottom w:val="none" w:color="FFFFFF" w:sz="0"/>
+              <w:right w:val="none" w:color="FFFFFF" w:sz="0"/>
+            </w:tcBorders>
+            <w:vAlign w:val="center"/>
+          </w:tcPr>
+          <w:p>
+            <w:pPr>
+              <w:bidi/>
+              <w:spacing w:after="30" w:before="30" w:line="300"/>
+              <w:jc w:val="center"/>
+            </w:pPr>
+            <w:r>
+              <w:rPr>
+                <w:rFonts w:ascii="Arial" w:cs="Arial" w:hAnsi="Arial"/>
+                <w:sz w:val="26"/>
+                <w:szCs w:val="26"/>
+                <w:rtl/>
+              </w:rPr>
+              <w:t xml:space="preserve">שווה שוקיים</w:t>
+            </w:r>
+          </w:p>
+        </w:tc>
+        <w:tc>
+          <w:tcPr>
+            <w:tcW w:type="dxa" w:w="2668"/>
+            <w:tcBorders>
+              <w:top w:val="none" w:color="FFFFFF" w:sz="0"/>
+              <w:left w:val="none" w:color="FFFFFF" w:sz="0"/>
+              <w:bottom w:val="none" w:color="FFFFFF" w:sz="0"/>
+              <w:right w:val="none" w:color="FFFFFF" w:sz="0"/>
+            </w:tcBorders>
+            <w:vAlign w:val="center"/>
+          </w:tcPr>
+          <w:p>
+            <w:pPr>
+              <w:bidi/>
+              <w:spacing w:after="30" w:before="30" w:line="300"/>
+              <w:jc w:val="center"/>
+            </w:pPr>
+            <w:r>
+              <w:rPr>
+                <w:rFonts w:ascii="Arial" w:cs="Arial" w:hAnsi="Arial"/>
+                <w:sz w:val="26"/>
+                <w:szCs w:val="26"/>
+                <w:rtl/>
+              </w:rPr>
+              <w:t xml:space="preserve">שונה צלעות</w:t>
+            </w:r>
           </w:p>
         </w:tc>
       </w:tr>
     </w:tbl>
     <w:p>
       <w:pPr>
+        <w:keepNext/>
         <w:bidi/>
         <w:spacing w:after="60" w:before="60" w:line="300"/>
       </w:pPr>
@@ -4085,9 +5466,178 @@
           <w:szCs w:val="26"/>
           <w:rtl/>
         </w:rPr>
-        <w:t xml:space="preserve">לכל הצלעות של משולש שווה צלעות יש אורך 5 ס"מ. מה סכום אורכי כל הצלעות?  ________</w:t>
+        <w:t xml:space="preserve">לכל הצלעות של משולש שווה צלעות יש אורך 5 ס"מ. מה סכום אורכי כל הצלעות?</w:t>
       </w:r>
     </w:p>
+    <w:tbl>
+      <w:tblPr>
+        <w:bidiVisual/>
+        <w:tblW w:type="dxa" w:w="9904"/>
+        <w:tblBorders>
+          <w:top w:val="none" w:color="FFFFFF" w:sz="0"/>
+          <w:left w:val="none" w:color="FFFFFF" w:sz="0"/>
+          <w:bottom w:val="none" w:color="FFFFFF" w:sz="0"/>
+          <w:right w:val="none" w:color="FFFFFF" w:sz="0"/>
+          <w:insideH w:val="none" w:color="FFFFFF" w:sz="0"/>
+          <w:insideV w:val="none" w:color="FFFFFF" w:sz="0"/>
+        </w:tblBorders>
+        <w:tblLayout w:type="fixed"/>
+      </w:tblPr>
+      <w:tblGrid>
+        <w:gridCol w:w="400"/>
+        <w:gridCol w:w="2376"/>
+        <w:gridCol w:w="2376"/>
+        <w:gridCol w:w="2376"/>
+        <w:gridCol w:w="2376"/>
+      </w:tblGrid>
+      <w:tr>
+        <w:trPr>
+          <w:cantSplit/>
+          <w:trHeight w:val="400" w:hRule="atLeast"/>
+        </w:trPr>
+        <w:tc>
+          <w:tcPr>
+            <w:tcW w:type="dxa" w:w="400"/>
+            <w:tcBorders>
+              <w:top w:val="none" w:color="FFFFFF" w:sz="0"/>
+              <w:left w:val="none" w:color="FFFFFF" w:sz="0"/>
+              <w:bottom w:val="none" w:color="FFFFFF" w:sz="0"/>
+              <w:right w:val="none" w:color="FFFFFF" w:sz="0"/>
+            </w:tcBorders>
+            <w:vAlign w:val="center"/>
+          </w:tcPr>
+          <w:p>
+            <w:pPr>
+              <w:bidi/>
+              <w:spacing w:after="30" w:before="30" w:line="300"/>
+            </w:pPr>
+            <w:r>
+              <w:rPr>
+                <w:rFonts w:ascii="Arial" w:cs="Arial" w:hAnsi="Arial"/>
+                <w:b/>
+                <w:bCs/>
+                <w:sz w:val="26"/>
+                <w:szCs w:val="26"/>
+                <w:rtl/>
+              </w:rPr>
+              <w:t xml:space="preserve"/>
+            </w:r>
+          </w:p>
+        </w:tc>
+        <w:tc>
+          <w:tcPr>
+            <w:tcW w:type="dxa" w:w="2376"/>
+            <w:tcBorders>
+              <w:top w:val="none" w:color="FFFFFF" w:sz="0"/>
+              <w:left w:val="none" w:color="FFFFFF" w:sz="0"/>
+              <w:bottom w:val="none" w:color="FFFFFF" w:sz="0"/>
+              <w:right w:val="none" w:color="FFFFFF" w:sz="0"/>
+            </w:tcBorders>
+            <w:vAlign w:val="center"/>
+          </w:tcPr>
+          <w:p>
+            <w:pPr>
+              <w:bidi/>
+              <w:spacing w:after="30" w:before="30" w:line="300"/>
+              <w:jc w:val="center"/>
+            </w:pPr>
+            <w:r>
+              <w:rPr>
+                <w:rFonts w:ascii="Arial" w:cs="Arial" w:hAnsi="Arial"/>
+                <w:sz w:val="26"/>
+                <w:szCs w:val="26"/>
+                <w:rtl/>
+              </w:rPr>
+              <w:t xml:space="preserve">10 ס"מ</w:t>
+            </w:r>
+          </w:p>
+        </w:tc>
+        <w:tc>
+          <w:tcPr>
+            <w:tcW w:type="dxa" w:w="2376"/>
+            <w:tcBorders>
+              <w:top w:val="none" w:color="FFFFFF" w:sz="0"/>
+              <w:left w:val="none" w:color="FFFFFF" w:sz="0"/>
+              <w:bottom w:val="none" w:color="FFFFFF" w:sz="0"/>
+              <w:right w:val="none" w:color="FFFFFF" w:sz="0"/>
+            </w:tcBorders>
+            <w:vAlign w:val="center"/>
+          </w:tcPr>
+          <w:p>
+            <w:pPr>
+              <w:bidi/>
+              <w:spacing w:after="30" w:before="30" w:line="300"/>
+              <w:jc w:val="center"/>
+            </w:pPr>
+            <w:r>
+              <w:rPr>
+                <w:rFonts w:ascii="Arial" w:cs="Arial" w:hAnsi="Arial"/>
+                <w:sz w:val="26"/>
+                <w:szCs w:val="26"/>
+                <w:rtl/>
+              </w:rPr>
+              <w:t xml:space="preserve">15 ס"מ</w:t>
+            </w:r>
+          </w:p>
+        </w:tc>
+        <w:tc>
+          <w:tcPr>
+            <w:tcW w:type="dxa" w:w="2376"/>
+            <w:tcBorders>
+              <w:top w:val="none" w:color="FFFFFF" w:sz="0"/>
+              <w:left w:val="none" w:color="FFFFFF" w:sz="0"/>
+              <w:bottom w:val="none" w:color="FFFFFF" w:sz="0"/>
+              <w:right w:val="none" w:color="FFFFFF" w:sz="0"/>
+            </w:tcBorders>
+            <w:vAlign w:val="center"/>
+          </w:tcPr>
+          <w:p>
+            <w:pPr>
+              <w:bidi/>
+              <w:spacing w:after="30" w:before="30" w:line="300"/>
+              <w:jc w:val="center"/>
+            </w:pPr>
+            <w:r>
+              <w:rPr>
+                <w:rFonts w:ascii="Arial" w:cs="Arial" w:hAnsi="Arial"/>
+                <w:sz w:val="26"/>
+                <w:szCs w:val="26"/>
+                <w:rtl/>
+              </w:rPr>
+              <w:t xml:space="preserve">20 ס"מ</w:t>
+            </w:r>
+          </w:p>
+        </w:tc>
+        <w:tc>
+          <w:tcPr>
+            <w:tcW w:type="dxa" w:w="2376"/>
+            <w:tcBorders>
+              <w:top w:val="none" w:color="FFFFFF" w:sz="0"/>
+              <w:left w:val="none" w:color="FFFFFF" w:sz="0"/>
+              <w:bottom w:val="none" w:color="FFFFFF" w:sz="0"/>
+              <w:right w:val="none" w:color="FFFFFF" w:sz="0"/>
+            </w:tcBorders>
+            <w:vAlign w:val="center"/>
+          </w:tcPr>
+          <w:p>
+            <w:pPr>
+              <w:bidi/>
+              <w:spacing w:after="30" w:before="30" w:line="300"/>
+              <w:jc w:val="center"/>
+            </w:pPr>
+            <w:r>
+              <w:rPr>
+                <w:rFonts w:ascii="Arial" w:cs="Arial" w:hAnsi="Arial"/>
+                <w:sz w:val="26"/>
+                <w:szCs w:val="26"/>
+                <w:rtl/>
+              </w:rPr>
+              <w:t xml:space="preserve">25 ס"מ</w:t>
+            </w:r>
+          </w:p>
+        </w:tc>
+      </w:tr>
+    </w:tbl>
     <w:p>
       <w:pPr>
         <w:bidi/>
@@ -6573,7 +8123,7 @@
                 <w:szCs w:val="22"/>
                 <w:rtl/>
               </w:rPr>
-              <w:t xml:space="preserve">1 משולש, 2 מרובע (ריבוע), 3 מחומש, 5 משושה.</w:t>
+              <w:t xml:space="preserve">1 משולש, 2 מרובע, 3 מחומש, 5 משושה.</w:t>
             </w:r>
           </w:p>
         </w:tc>
@@ -6680,7 +8230,7 @@
                 <w:szCs w:val="22"/>
                 <w:rtl/>
               </w:rPr>
-              <w:t xml:space="preserve">צורה 4 – עיגול, הקו שלו עגול ולא ישר. צורה 6 – הקו לא סגור.</w:t>
+              <w:t xml:space="preserve">צורות 4 ו-6.</w:t>
             </w:r>
           </w:p>
         </w:tc>
@@ -6762,7 +8312,7 @@
                 <w:szCs w:val="22"/>
                 <w:rtl/>
               </w:rPr>
-              <w:t xml:space="preserve">5 צלעות ו-5 קודקודים. 6 צלעות.</w:t>
+              <w:t xml:space="preserve">קו עגול או לא סגור: צורה 4 עגולה, וצורה 6 לא סגורה.</w:t>
             </w:r>
           </w:p>
         </w:tc>
@@ -6844,6 +8394,88 @@
                 <w:szCs w:val="22"/>
                 <w:rtl/>
               </w:rPr>
+              <w:t xml:space="preserve">למחומש 5 צלעות ו-5 קודקודים. למשושה 6 צלעות.</w:t>
+            </w:r>
+          </w:p>
+        </w:tc>
+        <w:tc>
+          <w:tcPr>
+            <w:tcW w:type="dxa" w:w="950"/>
+            <w:tcBorders>
+              <w:top w:val="single" w:color="777777" w:sz="6"/>
+              <w:left w:val="single" w:color="777777" w:sz="6"/>
+              <w:bottom w:val="single" w:color="777777" w:sz="6"/>
+              <w:right w:val="single" w:color="777777" w:sz="6"/>
+            </w:tcBorders>
+            <w:tcMar>
+              <w:left w:type="dxa" w:w="120"/>
+              <w:right w:type="dxa" w:w="120"/>
+            </w:tcMar>
+            <w:vAlign w:val="center"/>
+          </w:tcPr>
+          <w:p>
+            <w:pPr>
+              <w:bidi/>
+              <w:spacing w:after="10" w:before="10" w:line="300"/>
+              <w:jc w:val="center"/>
+            </w:pPr>
+            <w:r>
+              <w:rPr>
+                <w:rFonts w:ascii="Arial" w:cs="Arial" w:hAnsi="Arial"/>
+                <w:b/>
+                <w:bCs/>
+                <w:sz w:val="26"/>
+                <w:szCs w:val="26"/>
+                <w:rtl/>
+              </w:rPr>
+              <w:t xml:space="preserve">ד</w:t>
+            </w:r>
+          </w:p>
+        </w:tc>
+        <w:tc>
+          <w:tcPr>
+            <w:vMerge w:val="continue"/>
+            <w:tcBorders>
+              <w:top w:val="single" w:color="777777" w:sz="6"/>
+              <w:left w:val="single" w:color="777777" w:sz="6"/>
+              <w:bottom w:val="single" w:color="777777" w:sz="6"/>
+              <w:right w:val="single" w:color="777777" w:sz="6"/>
+            </w:tcBorders>
+          </w:tcPr>
+          <w:p/>
+        </w:tc>
+      </w:tr>
+      <w:tr>
+        <w:trPr>
+          <w:cantSplit/>
+        </w:trPr>
+        <w:tc>
+          <w:tcPr>
+            <w:tcW w:type="dxa" w:w="7656"/>
+            <w:tcBorders>
+              <w:top w:val="single" w:color="777777" w:sz="6"/>
+              <w:left w:val="single" w:color="777777" w:sz="6"/>
+              <w:bottom w:val="single" w:color="777777" w:sz="6"/>
+              <w:right w:val="single" w:color="777777" w:sz="6"/>
+            </w:tcBorders>
+            <w:tcMar>
+              <w:left w:type="dxa" w:w="120"/>
+              <w:right w:type="dxa" w:w="120"/>
+            </w:tcMar>
+            <w:vAlign w:val="center"/>
+          </w:tcPr>
+          <w:p>
+            <w:pPr>
+              <w:bidi/>
+              <w:spacing w:after="10" w:before="10" w:line="300"/>
+            </w:pPr>
+            <w:r>
+              <w:rPr>
+                <w:rFonts w:ascii="Arial" w:cs="Arial" w:hAnsi="Arial"/>
+                <w:sz w:val="22"/>
+                <w:szCs w:val="22"/>
+                <w:rtl/>
+              </w:rPr>
               <w:t xml:space="preserve">א – שווה צלעות, ב – שווה שוקיים, ג – שונה צלעות.</w:t>
             </w:r>
           </w:p>
@@ -6941,18 +8573,17 @@
           </w:tcPr>
           <w:p>
             <w:pPr>
-              <w:bidi w:val="false"/>
+              <w:bidi/>
               <w:spacing w:after="10" w:before="10" w:line="300"/>
-              <w:jc w:val="right"/>
             </w:pPr>
             <w:r>
               <w:rPr>
                 <w:rFonts w:ascii="Arial" w:cs="Arial" w:hAnsi="Arial"/>
                 <w:sz w:val="22"/>
                 <w:szCs w:val="22"/>
-                <w:rtl w:val="false"/>
-              </w:rPr>
-              <w:t xml:space="preserve">5 + 5 + 5 = 15   ס"מ</w:t>
+                <w:rtl/>
+              </w:rPr>
+              <w:t xml:space="preserve">15 ס"מ – כי 5 ועוד 5 ועוד 5 הם 15.</w:t>
             </w:r>
           </w:p>
         </w:tc>

</xml_diff>

<commit_message>
Grade 3 math review: remove difficulty levels
Drop the ★/★★/★★★ marks and the difficulty legend from the pages, the Word file and both PDFs.

Co-Authored-By: Claude Opus 5.5 <noreply@anthropic.com>
Claude-Session: https://claude.ai/code/session_01DbA2Kr9aJGwQWBhin7fkBe
</commit_message>
<xml_diff>
--- a/content/elementary/math/03-grade-3-test-review/_files/grade-3-math-review.docx
+++ b/content/elementary/math/03-grade-3-test-review/_files/grade-3-math-review.docx
@@ -52,7 +52,7 @@
           <w:szCs w:val="26"/>
           <w:rtl/>
         </w:rPr>
-        <w:t xml:space="preserve">דרגת קושי:  </w:t>
+        <w:t xml:space="preserve"/>
       </w:r>
       <w:r>
         <w:rPr>
@@ -64,7 +64,7 @@
           <w:szCs w:val="26"/>
           <w:rtl/>
         </w:rPr>
-        <w:t xml:space="preserve">★</w:t>
+        <w:t xml:space="preserve"/>
       </w:r>
       <w:r>
         <w:rPr>
@@ -73,7 +73,7 @@
           <w:szCs w:val="24"/>
           <w:rtl/>
         </w:rPr>
-        <w:t xml:space="preserve"> קל    </w:t>
+        <w:t xml:space="preserve"/>
       </w:r>
       <w:r>
         <w:rPr>
@@ -85,7 +85,7 @@
           <w:szCs w:val="26"/>
           <w:rtl/>
         </w:rPr>
-        <w:t xml:space="preserve">★★</w:t>
+        <w:t xml:space="preserve"/>
       </w:r>
       <w:r>
         <w:rPr>
@@ -94,7 +94,7 @@
           <w:szCs w:val="24"/>
           <w:rtl/>
         </w:rPr>
-        <w:t xml:space="preserve"> בינוני    </w:t>
+        <w:t xml:space="preserve"/>
       </w:r>
       <w:r>
         <w:rPr>
@@ -106,7 +106,7 @@
           <w:szCs w:val="26"/>
           <w:rtl/>
         </w:rPr>
-        <w:t xml:space="preserve">★★★</w:t>
+        <w:t xml:space="preserve"/>
       </w:r>
       <w:r>
         <w:rPr>
@@ -115,7 +115,7 @@
           <w:szCs w:val="24"/>
           <w:rtl/>
         </w:rPr>
-        <w:t xml:space="preserve"> מאתגר        </w:t>
+        <w:t xml:space="preserve"/>
       </w:r>
       <w:r>
         <w:rPr>
@@ -196,7 +196,7 @@
           <w:szCs w:val="26"/>
           <w:rtl/>
         </w:rPr>
-        <w:t xml:space="preserve">★  </w:t>
+        <w:t xml:space="preserve"/>
       </w:r>
       <w:r>
         <w:rPr>
@@ -234,7 +234,7 @@
           <w:szCs w:val="26"/>
           <w:rtl/>
         </w:rPr>
-        <w:t xml:space="preserve">★  </w:t>
+        <w:t xml:space="preserve"/>
       </w:r>
       <w:r>
         <w:rPr>
@@ -272,7 +272,7 @@
           <w:szCs w:val="26"/>
           <w:rtl/>
         </w:rPr>
-        <w:t xml:space="preserve">★★  </w:t>
+        <w:t xml:space="preserve"/>
       </w:r>
       <w:r>
         <w:rPr>
@@ -332,7 +332,7 @@
           <w:szCs w:val="26"/>
           <w:rtl/>
         </w:rPr>
-        <w:t xml:space="preserve">★  </w:t>
+        <w:t xml:space="preserve"/>
       </w:r>
       <w:r>
         <w:rPr>
@@ -370,7 +370,7 @@
           <w:szCs w:val="26"/>
           <w:rtl/>
         </w:rPr>
-        <w:t xml:space="preserve">★★  </w:t>
+        <w:t xml:space="preserve"/>
       </w:r>
       <w:r>
         <w:rPr>
@@ -408,7 +408,7 @@
           <w:szCs w:val="26"/>
           <w:rtl/>
         </w:rPr>
-        <w:t xml:space="preserve">★★  </w:t>
+        <w:t xml:space="preserve"/>
       </w:r>
       <w:r>
         <w:rPr>
@@ -469,7 +469,7 @@
           <w:szCs w:val="26"/>
           <w:rtl/>
         </w:rPr>
-        <w:t xml:space="preserve">★  </w:t>
+        <w:t xml:space="preserve"/>
       </w:r>
       <w:r>
         <w:rPr>
@@ -694,7 +694,7 @@
           <w:szCs w:val="26"/>
           <w:rtl/>
         </w:rPr>
-        <w:t xml:space="preserve">★★  </w:t>
+        <w:t xml:space="preserve"/>
       </w:r>
       <w:r>
         <w:rPr>
@@ -714,7 +714,7 @@
           <w:szCs w:val="26"/>
           <w:rtl/>
         </w:rPr>
-        <w:t xml:space="preserve">השלימו את הטבלה (בשורה האחרונה ★★★):</w:t>
+        <w:t xml:space="preserve">השלימו את הטבלה:</w:t>
       </w:r>
     </w:p>
     <w:tbl>
@@ -1087,7 +1087,7 @@
           <w:szCs w:val="26"/>
           <w:rtl/>
         </w:rPr>
-        <w:t xml:space="preserve">★★  </w:t>
+        <w:t xml:space="preserve"/>
       </w:r>
       <w:r>
         <w:rPr>
@@ -1366,7 +1366,7 @@
                 <w:szCs w:val="20"/>
                 <w:rtl w:val="false"/>
               </w:rPr>
-              <w:t xml:space="preserve">   ★</w:t>
+              <w:t xml:space="preserve"/>
             </w:r>
           </w:p>
         </w:tc>
@@ -1405,7 +1405,7 @@
                 <w:szCs w:val="20"/>
                 <w:rtl w:val="false"/>
               </w:rPr>
-              <w:t xml:space="preserve">   ★★</w:t>
+              <w:t xml:space="preserve"/>
             </w:r>
           </w:p>
         </w:tc>
@@ -1463,7 +1463,7 @@
                 <w:szCs w:val="20"/>
                 <w:rtl w:val="false"/>
               </w:rPr>
-              <w:t xml:space="preserve">   ★★★</w:t>
+              <w:t xml:space="preserve"/>
             </w:r>
           </w:p>
         </w:tc>
@@ -1576,7 +1576,7 @@
                 <w:szCs w:val="20"/>
                 <w:rtl w:val="false"/>
               </w:rPr>
-              <w:t xml:space="preserve">   ★</w:t>
+              <w:t xml:space="preserve"/>
             </w:r>
           </w:p>
         </w:tc>
@@ -1616,7 +1616,7 @@
                 <w:szCs w:val="20"/>
                 <w:rtl w:val="false"/>
               </w:rPr>
-              <w:t xml:space="preserve">   ★</w:t>
+              <w:t xml:space="preserve"/>
             </w:r>
           </w:p>
         </w:tc>
@@ -1675,7 +1675,7 @@
                 <w:szCs w:val="20"/>
                 <w:rtl w:val="false"/>
               </w:rPr>
-              <w:t xml:space="preserve">   ★★</w:t>
+              <w:t xml:space="preserve"/>
             </w:r>
           </w:p>
         </w:tc>
@@ -1714,7 +1714,7 @@
                 <w:szCs w:val="20"/>
                 <w:rtl w:val="false"/>
               </w:rPr>
-              <w:t xml:space="preserve">   ★★★</w:t>
+              <w:t xml:space="preserve"/>
             </w:r>
           </w:p>
         </w:tc>
@@ -1804,7 +1804,7 @@
           <w:szCs w:val="26"/>
           <w:rtl/>
         </w:rPr>
-        <w:t xml:space="preserve">★★  </w:t>
+        <w:t xml:space="preserve"/>
       </w:r>
       <w:r>
         <w:rPr>
@@ -1842,7 +1842,7 @@
           <w:szCs w:val="26"/>
           <w:rtl/>
         </w:rPr>
-        <w:t xml:space="preserve">★★★  </w:t>
+        <w:t xml:space="preserve"/>
       </w:r>
       <w:r>
         <w:rPr>
@@ -1957,7 +1957,7 @@
                 <w:szCs w:val="26"/>
                 <w:rtl w:val="false"/>
               </w:rPr>
-              <w:t xml:space="preserve">★</w:t>
+              <w:t xml:space="preserve"/>
             </w:r>
           </w:p>
         </w:tc>
@@ -2005,7 +2005,7 @@
                 <w:szCs w:val="26"/>
                 <w:rtl w:val="false"/>
               </w:rPr>
-              <w:t xml:space="preserve">★★</w:t>
+              <w:t xml:space="preserve"/>
             </w:r>
           </w:p>
         </w:tc>
@@ -2053,7 +2053,7 @@
                 <w:szCs w:val="26"/>
                 <w:rtl w:val="false"/>
               </w:rPr>
-              <w:t xml:space="preserve">★★</w:t>
+              <w:t xml:space="preserve"/>
             </w:r>
           </w:p>
         </w:tc>
@@ -2101,7 +2101,7 @@
                 <w:szCs w:val="26"/>
                 <w:rtl w:val="false"/>
               </w:rPr>
-              <w:t xml:space="preserve">★★★</w:t>
+              <w:t xml:space="preserve"/>
             </w:r>
           </w:p>
         </w:tc>
@@ -2643,7 +2643,7 @@
                 <w:szCs w:val="20"/>
                 <w:rtl w:val="false"/>
               </w:rPr>
-              <w:t xml:space="preserve">   ★</w:t>
+              <w:t xml:space="preserve"/>
             </w:r>
           </w:p>
         </w:tc>
@@ -2682,7 +2682,7 @@
                 <w:szCs w:val="20"/>
                 <w:rtl w:val="false"/>
               </w:rPr>
-              <w:t xml:space="preserve">   ★</w:t>
+              <w:t xml:space="preserve"/>
             </w:r>
           </w:p>
         </w:tc>
@@ -2721,7 +2721,7 @@
                 <w:szCs w:val="20"/>
                 <w:rtl w:val="false"/>
               </w:rPr>
-              <w:t xml:space="preserve">   ★</w:t>
+              <w:t xml:space="preserve"/>
             </w:r>
           </w:p>
         </w:tc>
@@ -2760,7 +2760,7 @@
                 <w:szCs w:val="20"/>
                 <w:rtl w:val="false"/>
               </w:rPr>
-              <w:t xml:space="preserve">   ★</w:t>
+              <w:t xml:space="preserve"/>
             </w:r>
           </w:p>
         </w:tc>
@@ -2820,7 +2820,7 @@
                 <w:szCs w:val="20"/>
                 <w:rtl w:val="false"/>
               </w:rPr>
-              <w:t xml:space="preserve">   ★★</w:t>
+              <w:t xml:space="preserve"/>
             </w:r>
           </w:p>
         </w:tc>
@@ -2859,7 +2859,7 @@
                 <w:szCs w:val="20"/>
                 <w:rtl w:val="false"/>
               </w:rPr>
-              <w:t xml:space="preserve">   ★★</w:t>
+              <w:t xml:space="preserve"/>
             </w:r>
           </w:p>
         </w:tc>
@@ -2898,7 +2898,7 @@
                 <w:szCs w:val="20"/>
                 <w:rtl w:val="false"/>
               </w:rPr>
-              <w:t xml:space="preserve">   ★★★</w:t>
+              <w:t xml:space="preserve"/>
             </w:r>
           </w:p>
         </w:tc>
@@ -2919,7 +2919,7 @@
           <w:szCs w:val="26"/>
           <w:rtl/>
         </w:rPr>
-        <w:t xml:space="preserve">★★  </w:t>
+        <w:t xml:space="preserve"/>
       </w:r>
       <w:r>
         <w:rPr>
@@ -2958,7 +2958,7 @@
           <w:szCs w:val="26"/>
           <w:rtl/>
         </w:rPr>
-        <w:t xml:space="preserve">★★★  </w:t>
+        <w:t xml:space="preserve"/>
       </w:r>
       <w:r>
         <w:rPr>
@@ -3109,7 +3109,7 @@
           <w:szCs w:val="26"/>
           <w:rtl/>
         </w:rPr>
-        <w:t xml:space="preserve">★  </w:t>
+        <w:t xml:space="preserve"/>
       </w:r>
       <w:r>
         <w:rPr>
@@ -3163,7 +3163,7 @@
           <w:szCs w:val="26"/>
           <w:rtl/>
         </w:rPr>
-        <w:t xml:space="preserve">★★  </w:t>
+        <w:t xml:space="preserve"/>
       </w:r>
       <w:r>
         <w:rPr>
@@ -3217,7 +3217,7 @@
           <w:szCs w:val="26"/>
           <w:rtl/>
         </w:rPr>
-        <w:t xml:space="preserve">★★  </w:t>
+        <w:t xml:space="preserve"/>
       </w:r>
       <w:r>
         <w:rPr>
@@ -3271,7 +3271,7 @@
           <w:szCs w:val="26"/>
           <w:rtl/>
         </w:rPr>
-        <w:t xml:space="preserve">★★★  </w:t>
+        <w:t xml:space="preserve"/>
       </w:r>
       <w:r>
         <w:rPr>
@@ -3433,7 +3433,7 @@
           <w:szCs w:val="26"/>
           <w:rtl/>
         </w:rPr>
-        <w:t xml:space="preserve">★  </w:t>
+        <w:t xml:space="preserve"/>
       </w:r>
       <w:r>
         <w:rPr>
@@ -4082,7 +4082,7 @@
           <w:szCs w:val="26"/>
           <w:rtl/>
         </w:rPr>
-        <w:t xml:space="preserve">★★  </w:t>
+        <w:t xml:space="preserve"/>
       </w:r>
       <w:r>
         <w:rPr>
@@ -4348,7 +4348,7 @@
           <w:szCs w:val="26"/>
           <w:rtl/>
         </w:rPr>
-        <w:t xml:space="preserve">★★  </w:t>
+        <w:t xml:space="preserve"/>
       </w:r>
       <w:r>
         <w:rPr>
@@ -4527,7 +4527,7 @@
           <w:szCs w:val="26"/>
           <w:rtl/>
         </w:rPr>
-        <w:t xml:space="preserve">★  </w:t>
+        <w:t xml:space="preserve"/>
       </w:r>
       <w:r>
         <w:rPr>
@@ -5029,7 +5029,7 @@
           <w:szCs w:val="26"/>
           <w:rtl/>
         </w:rPr>
-        <w:t xml:space="preserve">★★  </w:t>
+        <w:t xml:space="preserve"/>
       </w:r>
       <w:r>
         <w:rPr>
@@ -5446,7 +5446,7 @@
           <w:szCs w:val="26"/>
           <w:rtl/>
         </w:rPr>
-        <w:t xml:space="preserve">★★★  </w:t>
+        <w:t xml:space="preserve"/>
       </w:r>
       <w:r>
         <w:rPr>
@@ -6602,7 +6602,7 @@
                 <w:szCs w:val="26"/>
                 <w:rtl/>
               </w:rPr>
-              <w:t xml:space="preserve">★</w:t>
+              <w:t xml:space="preserve"/>
             </w:r>
           </w:p>
         </w:tc>
@@ -6710,7 +6710,7 @@
                 <w:szCs w:val="26"/>
                 <w:rtl/>
               </w:rPr>
-              <w:t xml:space="preserve">★★</w:t>
+              <w:t xml:space="preserve"/>
             </w:r>
           </w:p>
         </w:tc>
@@ -6793,7 +6793,7 @@
                 <w:szCs w:val="26"/>
                 <w:rtl/>
               </w:rPr>
-              <w:t xml:space="preserve">★★★</w:t>
+              <w:t xml:space="preserve"/>
             </w:r>
           </w:p>
         </w:tc>
@@ -7445,7 +7445,7 @@
                 <w:szCs w:val="26"/>
                 <w:rtl/>
               </w:rPr>
-              <w:t xml:space="preserve">★</w:t>
+              <w:t xml:space="preserve"/>
             </w:r>
           </w:p>
         </w:tc>
@@ -7553,7 +7553,7 @@
                 <w:szCs w:val="26"/>
                 <w:rtl/>
               </w:rPr>
-              <w:t xml:space="preserve">★★</w:t>
+              <w:t xml:space="preserve"/>
             </w:r>
           </w:p>
         </w:tc>
@@ -7718,7 +7718,7 @@
                 <w:szCs w:val="26"/>
                 <w:rtl/>
               </w:rPr>
-              <w:t xml:space="preserve">★★★</w:t>
+              <w:t xml:space="preserve"/>
             </w:r>
           </w:p>
         </w:tc>

</xml_diff>